<commit_message>
Update tests for extended target attributes
</commit_message>
<xml_diff>
--- a/tests/_fixtures/a_book/00_index.docx
+++ b/tests/_fixtures/a_book/00_index.docx
@@ -1,6 +1,6 @@
 
 <file path=word/document.xml><?xml version="1.0" encoding="utf-8"?>
-<w:document xmlns:wpc="http://schemas.microsoft.com/office/word/2010/wordprocessingCanvas" xmlns:cx="http://schemas.microsoft.com/office/drawing/2014/chartex" xmlns:cx1="http://schemas.microsoft.com/office/drawing/2015/9/8/chartex" xmlns:cx2="http://schemas.microsoft.com/office/drawing/2015/10/21/chartex" xmlns:cx3="http://schemas.microsoft.com/office/drawing/2016/5/9/chartex" xmlns:cx4="http://schemas.microsoft.com/office/drawing/2016/5/10/chartex" xmlns:cx5="http://schemas.microsoft.com/office/drawing/2016/5/11/chartex" xmlns:cx6="http://schemas.microsoft.com/office/drawing/2016/5/12/chartex" xmlns:cx7="http://schemas.microsoft.com/office/drawing/2016/5/13/chartex" xmlns:cx8="http://schemas.microsoft.com/office/drawing/2016/5/14/chartex" xmlns:mc="http://schemas.openxmlformats.org/markup-compatibility/2006" xmlns:aink="http://schemas.microsoft.com/office/drawing/2016/ink" xmlns:am3d="http://schemas.microsoft.com/office/drawing/2017/model3d" xmlns:o="urn:schemas-microsoft-com:office:office" xmlns:oel="http://schemas.microsoft.com/office/2019/extlst" xmlns:r="http://schemas.openxmlformats.org/officeDocument/2006/relationships" xmlns:m="http://schemas.openxmlformats.org/officeDocument/2006/math" xmlns:v="urn:schemas-microsoft-com:vml" xmlns:wp14="http://schemas.microsoft.com/office/word/2010/wordprocessingDrawing" xmlns:wp="http://schemas.openxmlformats.org/drawingml/2006/wordprocessingDrawing" xmlns:w10="urn:schemas-microsoft-com:office:word" xmlns:w="http://schemas.openxmlformats.org/wordprocessingml/2006/main" xmlns:w14="http://schemas.microsoft.com/office/word/2010/wordml" xmlns:w15="http://schemas.microsoft.com/office/word/2012/wordml" xmlns:w16cex="http://schemas.microsoft.com/office/word/2018/wordml/cex" xmlns:w16cid="http://schemas.microsoft.com/office/word/2016/wordml/cid" xmlns:w16="http://schemas.microsoft.com/office/word/2018/wordml" xmlns:w16sdtdh="http://schemas.microsoft.com/office/word/2020/wordml/sdtdatahash" xmlns:w16se="http://schemas.microsoft.com/office/word/2015/wordml/symex" xmlns:wpg="http://schemas.microsoft.com/office/word/2010/wordprocessingGroup" xmlns:wpi="http://schemas.microsoft.com/office/word/2010/wordprocessingInk" xmlns:wne="http://schemas.microsoft.com/office/word/2006/wordml" xmlns:wps="http://schemas.microsoft.com/office/word/2010/wordprocessingShape" mc:Ignorable="w14 w15 w16se w16cid w16 w16cex w16sdtdh wp14">
+<w:document xmlns:wpc="http://schemas.microsoft.com/office/word/2010/wordprocessingCanvas" xmlns:cx="http://schemas.microsoft.com/office/drawing/2014/chartex" xmlns:cx1="http://schemas.microsoft.com/office/drawing/2015/9/8/chartex" xmlns:cx2="http://schemas.microsoft.com/office/drawing/2015/10/21/chartex" xmlns:cx3="http://schemas.microsoft.com/office/drawing/2016/5/9/chartex" xmlns:cx4="http://schemas.microsoft.com/office/drawing/2016/5/10/chartex" xmlns:cx5="http://schemas.microsoft.com/office/drawing/2016/5/11/chartex" xmlns:cx6="http://schemas.microsoft.com/office/drawing/2016/5/12/chartex" xmlns:cx7="http://schemas.microsoft.com/office/drawing/2016/5/13/chartex" xmlns:cx8="http://schemas.microsoft.com/office/drawing/2016/5/14/chartex" xmlns:mc="http://schemas.openxmlformats.org/markup-compatibility/2006" xmlns:aink="http://schemas.microsoft.com/office/drawing/2016/ink" xmlns:am3d="http://schemas.microsoft.com/office/drawing/2017/model3d" xmlns:o="urn:schemas-microsoft-com:office:office" xmlns:oel="http://schemas.microsoft.com/office/2019/extlst" xmlns:r="http://schemas.openxmlformats.org/officeDocument/2006/relationships" xmlns:m="http://schemas.openxmlformats.org/officeDocument/2006/math" xmlns:v="urn:schemas-microsoft-com:vml" xmlns:wp14="http://schemas.microsoft.com/office/word/2010/wordprocessingDrawing" xmlns:wp="http://schemas.openxmlformats.org/drawingml/2006/wordprocessingDrawing" xmlns:w10="urn:schemas-microsoft-com:office:word" xmlns:w="http://schemas.openxmlformats.org/wordprocessingml/2006/main" xmlns:w14="http://schemas.microsoft.com/office/word/2010/wordml" xmlns:w15="http://schemas.microsoft.com/office/word/2012/wordml" xmlns:w16cex="http://schemas.microsoft.com/office/word/2018/wordml/cex" xmlns:w16cid="http://schemas.microsoft.com/office/word/2016/wordml/cid" xmlns:w16="http://schemas.microsoft.com/office/word/2018/wordml" xmlns:w16du="http://schemas.microsoft.com/office/word/2023/wordml/word16du" xmlns:w16sdtdh="http://schemas.microsoft.com/office/word/2020/wordml/sdtdatahash" xmlns:w16sdtfl="http://schemas.microsoft.com/office/word/2024/wordml/sdtformatlock" xmlns:w16se="http://schemas.microsoft.com/office/word/2015/wordml/symex" xmlns:wpg="http://schemas.microsoft.com/office/word/2010/wordprocessingGroup" xmlns:wpi="http://schemas.microsoft.com/office/word/2010/wordprocessingInk" xmlns:wne="http://schemas.microsoft.com/office/word/2006/wordml" xmlns:wps="http://schemas.microsoft.com/office/word/2010/wordprocessingShape" mc:Ignorable="w14 w15 w16se w16cid w16 w16cex w16sdtdh w16sdtfl w16du wp14">
   <w:body>
     <w:p>
       <w:pPr>
@@ -742,8 +742,19 @@
                 <w:szCs w:val="16"/>
                 <w:lang w:val="fr-FR"/>
               </w:rPr>
-              <w:t>## Alt text</w:t>
+              <w:t xml:space="preserve">## Alt </w:t>
             </w:r>
+            <w:proofErr w:type="spellStart"/>
+            <w:r>
+              <w:rPr>
+                <w:rFonts w:ascii="Calibri" w:eastAsia="Times New Roman" w:hAnsi="Calibri" w:cs="Calibri"/>
+                <w:sz w:val="16"/>
+                <w:szCs w:val="16"/>
+                <w:lang w:val="fr-FR"/>
+              </w:rPr>
+              <w:t>text</w:t>
+            </w:r>
+            <w:proofErr w:type="spellEnd"/>
           </w:p>
         </w:tc>
         <w:tc>
@@ -790,7 +801,7 @@
 </file>
 
 <file path=word/endnotes.xml><?xml version="1.0" encoding="utf-8"?>
-<w:endnotes xmlns:wpc="http://schemas.microsoft.com/office/word/2010/wordprocessingCanvas" xmlns:cx="http://schemas.microsoft.com/office/drawing/2014/chartex" xmlns:cx1="http://schemas.microsoft.com/office/drawing/2015/9/8/chartex" xmlns:cx2="http://schemas.microsoft.com/office/drawing/2015/10/21/chartex" xmlns:cx3="http://schemas.microsoft.com/office/drawing/2016/5/9/chartex" xmlns:cx4="http://schemas.microsoft.com/office/drawing/2016/5/10/chartex" xmlns:cx5="http://schemas.microsoft.com/office/drawing/2016/5/11/chartex" xmlns:cx6="http://schemas.microsoft.com/office/drawing/2016/5/12/chartex" xmlns:cx7="http://schemas.microsoft.com/office/drawing/2016/5/13/chartex" xmlns:cx8="http://schemas.microsoft.com/office/drawing/2016/5/14/chartex" xmlns:mc="http://schemas.openxmlformats.org/markup-compatibility/2006" xmlns:aink="http://schemas.microsoft.com/office/drawing/2016/ink" xmlns:am3d="http://schemas.microsoft.com/office/drawing/2017/model3d" xmlns:o="urn:schemas-microsoft-com:office:office" xmlns:oel="http://schemas.microsoft.com/office/2019/extlst" xmlns:r="http://schemas.openxmlformats.org/officeDocument/2006/relationships" xmlns:m="http://schemas.openxmlformats.org/officeDocument/2006/math" xmlns:v="urn:schemas-microsoft-com:vml" xmlns:wp14="http://schemas.microsoft.com/office/word/2010/wordprocessingDrawing" xmlns:wp="http://schemas.openxmlformats.org/drawingml/2006/wordprocessingDrawing" xmlns:w10="urn:schemas-microsoft-com:office:word" xmlns:w="http://schemas.openxmlformats.org/wordprocessingml/2006/main" xmlns:w14="http://schemas.microsoft.com/office/word/2010/wordml" xmlns:w15="http://schemas.microsoft.com/office/word/2012/wordml" xmlns:w16cex="http://schemas.microsoft.com/office/word/2018/wordml/cex" xmlns:w16cid="http://schemas.microsoft.com/office/word/2016/wordml/cid" xmlns:w16="http://schemas.microsoft.com/office/word/2018/wordml" xmlns:w16sdtdh="http://schemas.microsoft.com/office/word/2020/wordml/sdtdatahash" xmlns:w16se="http://schemas.microsoft.com/office/word/2015/wordml/symex" xmlns:wpg="http://schemas.microsoft.com/office/word/2010/wordprocessingGroup" xmlns:wpi="http://schemas.microsoft.com/office/word/2010/wordprocessingInk" xmlns:wne="http://schemas.microsoft.com/office/word/2006/wordml" xmlns:wps="http://schemas.microsoft.com/office/word/2010/wordprocessingShape" mc:Ignorable="w14 w15 w16se w16cid w16 w16cex w16sdtdh wp14">
+<w:endnotes xmlns:wpc="http://schemas.microsoft.com/office/word/2010/wordprocessingCanvas" xmlns:cx="http://schemas.microsoft.com/office/drawing/2014/chartex" xmlns:cx1="http://schemas.microsoft.com/office/drawing/2015/9/8/chartex" xmlns:cx2="http://schemas.microsoft.com/office/drawing/2015/10/21/chartex" xmlns:cx3="http://schemas.microsoft.com/office/drawing/2016/5/9/chartex" xmlns:cx4="http://schemas.microsoft.com/office/drawing/2016/5/10/chartex" xmlns:cx5="http://schemas.microsoft.com/office/drawing/2016/5/11/chartex" xmlns:cx6="http://schemas.microsoft.com/office/drawing/2016/5/12/chartex" xmlns:cx7="http://schemas.microsoft.com/office/drawing/2016/5/13/chartex" xmlns:cx8="http://schemas.microsoft.com/office/drawing/2016/5/14/chartex" xmlns:mc="http://schemas.openxmlformats.org/markup-compatibility/2006" xmlns:aink="http://schemas.microsoft.com/office/drawing/2016/ink" xmlns:am3d="http://schemas.microsoft.com/office/drawing/2017/model3d" xmlns:o="urn:schemas-microsoft-com:office:office" xmlns:oel="http://schemas.microsoft.com/office/2019/extlst" xmlns:r="http://schemas.openxmlformats.org/officeDocument/2006/relationships" xmlns:m="http://schemas.openxmlformats.org/officeDocument/2006/math" xmlns:v="urn:schemas-microsoft-com:vml" xmlns:wp14="http://schemas.microsoft.com/office/word/2010/wordprocessingDrawing" xmlns:wp="http://schemas.openxmlformats.org/drawingml/2006/wordprocessingDrawing" xmlns:w10="urn:schemas-microsoft-com:office:word" xmlns:w="http://schemas.openxmlformats.org/wordprocessingml/2006/main" xmlns:w14="http://schemas.microsoft.com/office/word/2010/wordml" xmlns:w15="http://schemas.microsoft.com/office/word/2012/wordml" xmlns:w16cex="http://schemas.microsoft.com/office/word/2018/wordml/cex" xmlns:w16cid="http://schemas.microsoft.com/office/word/2016/wordml/cid" xmlns:w16="http://schemas.microsoft.com/office/word/2018/wordml" xmlns:w16du="http://schemas.microsoft.com/office/word/2023/wordml/word16du" xmlns:w16sdtdh="http://schemas.microsoft.com/office/word/2020/wordml/sdtdatahash" xmlns:w16sdtfl="http://schemas.microsoft.com/office/word/2024/wordml/sdtformatlock" xmlns:w16se="http://schemas.microsoft.com/office/word/2015/wordml/symex" xmlns:wpg="http://schemas.microsoft.com/office/word/2010/wordprocessingGroup" xmlns:wpi="http://schemas.microsoft.com/office/word/2010/wordprocessingInk" xmlns:wne="http://schemas.microsoft.com/office/word/2006/wordml" xmlns:wps="http://schemas.microsoft.com/office/word/2010/wordprocessingShape" mc:Ignorable="w14 w15 w16se w16cid w16 w16cex w16sdtdh w16sdtfl w16du wp14">
   <w:endnote w:type="separator" w:id="-1">
     <w:p>
       <w:pPr>
@@ -822,7 +833,7 @@
 </file>
 
 <file path=word/footnotes.xml><?xml version="1.0" encoding="utf-8"?>
-<w:footnotes xmlns:wpc="http://schemas.microsoft.com/office/word/2010/wordprocessingCanvas" xmlns:cx="http://schemas.microsoft.com/office/drawing/2014/chartex" xmlns:cx1="http://schemas.microsoft.com/office/drawing/2015/9/8/chartex" xmlns:cx2="http://schemas.microsoft.com/office/drawing/2015/10/21/chartex" xmlns:cx3="http://schemas.microsoft.com/office/drawing/2016/5/9/chartex" xmlns:cx4="http://schemas.microsoft.com/office/drawing/2016/5/10/chartex" xmlns:cx5="http://schemas.microsoft.com/office/drawing/2016/5/11/chartex" xmlns:cx6="http://schemas.microsoft.com/office/drawing/2016/5/12/chartex" xmlns:cx7="http://schemas.microsoft.com/office/drawing/2016/5/13/chartex" xmlns:cx8="http://schemas.microsoft.com/office/drawing/2016/5/14/chartex" xmlns:mc="http://schemas.openxmlformats.org/markup-compatibility/2006" xmlns:aink="http://schemas.microsoft.com/office/drawing/2016/ink" xmlns:am3d="http://schemas.microsoft.com/office/drawing/2017/model3d" xmlns:o="urn:schemas-microsoft-com:office:office" xmlns:oel="http://schemas.microsoft.com/office/2019/extlst" xmlns:r="http://schemas.openxmlformats.org/officeDocument/2006/relationships" xmlns:m="http://schemas.openxmlformats.org/officeDocument/2006/math" xmlns:v="urn:schemas-microsoft-com:vml" xmlns:wp14="http://schemas.microsoft.com/office/word/2010/wordprocessingDrawing" xmlns:wp="http://schemas.openxmlformats.org/drawingml/2006/wordprocessingDrawing" xmlns:w10="urn:schemas-microsoft-com:office:word" xmlns:w="http://schemas.openxmlformats.org/wordprocessingml/2006/main" xmlns:w14="http://schemas.microsoft.com/office/word/2010/wordml" xmlns:w15="http://schemas.microsoft.com/office/word/2012/wordml" xmlns:w16cex="http://schemas.microsoft.com/office/word/2018/wordml/cex" xmlns:w16cid="http://schemas.microsoft.com/office/word/2016/wordml/cid" xmlns:w16="http://schemas.microsoft.com/office/word/2018/wordml" xmlns:w16sdtdh="http://schemas.microsoft.com/office/word/2020/wordml/sdtdatahash" xmlns:w16se="http://schemas.microsoft.com/office/word/2015/wordml/symex" xmlns:wpg="http://schemas.microsoft.com/office/word/2010/wordprocessingGroup" xmlns:wpi="http://schemas.microsoft.com/office/word/2010/wordprocessingInk" xmlns:wne="http://schemas.microsoft.com/office/word/2006/wordml" xmlns:wps="http://schemas.microsoft.com/office/word/2010/wordprocessingShape" mc:Ignorable="w14 w15 w16se w16cid w16 w16cex w16sdtdh wp14">
+<w:footnotes xmlns:wpc="http://schemas.microsoft.com/office/word/2010/wordprocessingCanvas" xmlns:cx="http://schemas.microsoft.com/office/drawing/2014/chartex" xmlns:cx1="http://schemas.microsoft.com/office/drawing/2015/9/8/chartex" xmlns:cx2="http://schemas.microsoft.com/office/drawing/2015/10/21/chartex" xmlns:cx3="http://schemas.microsoft.com/office/drawing/2016/5/9/chartex" xmlns:cx4="http://schemas.microsoft.com/office/drawing/2016/5/10/chartex" xmlns:cx5="http://schemas.microsoft.com/office/drawing/2016/5/11/chartex" xmlns:cx6="http://schemas.microsoft.com/office/drawing/2016/5/12/chartex" xmlns:cx7="http://schemas.microsoft.com/office/drawing/2016/5/13/chartex" xmlns:cx8="http://schemas.microsoft.com/office/drawing/2016/5/14/chartex" xmlns:mc="http://schemas.openxmlformats.org/markup-compatibility/2006" xmlns:aink="http://schemas.microsoft.com/office/drawing/2016/ink" xmlns:am3d="http://schemas.microsoft.com/office/drawing/2017/model3d" xmlns:o="urn:schemas-microsoft-com:office:office" xmlns:oel="http://schemas.microsoft.com/office/2019/extlst" xmlns:r="http://schemas.openxmlformats.org/officeDocument/2006/relationships" xmlns:m="http://schemas.openxmlformats.org/officeDocument/2006/math" xmlns:v="urn:schemas-microsoft-com:vml" xmlns:wp14="http://schemas.microsoft.com/office/word/2010/wordprocessingDrawing" xmlns:wp="http://schemas.openxmlformats.org/drawingml/2006/wordprocessingDrawing" xmlns:w10="urn:schemas-microsoft-com:office:word" xmlns:w="http://schemas.openxmlformats.org/wordprocessingml/2006/main" xmlns:w14="http://schemas.microsoft.com/office/word/2010/wordml" xmlns:w15="http://schemas.microsoft.com/office/word/2012/wordml" xmlns:w16cex="http://schemas.microsoft.com/office/word/2018/wordml/cex" xmlns:w16cid="http://schemas.microsoft.com/office/word/2016/wordml/cid" xmlns:w16="http://schemas.microsoft.com/office/word/2018/wordml" xmlns:w16du="http://schemas.microsoft.com/office/word/2023/wordml/word16du" xmlns:w16sdtdh="http://schemas.microsoft.com/office/word/2020/wordml/sdtdatahash" xmlns:w16sdtfl="http://schemas.microsoft.com/office/word/2024/wordml/sdtformatlock" xmlns:w16se="http://schemas.microsoft.com/office/word/2015/wordml/symex" xmlns:wpg="http://schemas.microsoft.com/office/word/2010/wordprocessingGroup" xmlns:wpi="http://schemas.microsoft.com/office/word/2010/wordprocessingInk" xmlns:wne="http://schemas.microsoft.com/office/word/2006/wordml" xmlns:wps="http://schemas.microsoft.com/office/word/2010/wordprocessingShape" mc:Ignorable="w14 w15 w16se w16cid w16 w16cex w16sdtdh w16sdtfl w16du wp14">
   <w:footnote w:type="separator" w:id="-1">
     <w:p>
       <w:r>
@@ -848,7 +859,7 @@
 </file>
 
 <file path=word/numbering.xml><?xml version="1.0" encoding="utf-8"?>
-<w:numbering xmlns:wpc="http://schemas.microsoft.com/office/word/2010/wordprocessingCanvas" xmlns:cx="http://schemas.microsoft.com/office/drawing/2014/chartex" xmlns:cx1="http://schemas.microsoft.com/office/drawing/2015/9/8/chartex" xmlns:cx2="http://schemas.microsoft.com/office/drawing/2015/10/21/chartex" xmlns:cx3="http://schemas.microsoft.com/office/drawing/2016/5/9/chartex" xmlns:cx4="http://schemas.microsoft.com/office/drawing/2016/5/10/chartex" xmlns:cx5="http://schemas.microsoft.com/office/drawing/2016/5/11/chartex" xmlns:cx6="http://schemas.microsoft.com/office/drawing/2016/5/12/chartex" xmlns:cx7="http://schemas.microsoft.com/office/drawing/2016/5/13/chartex" xmlns:cx8="http://schemas.microsoft.com/office/drawing/2016/5/14/chartex" xmlns:mc="http://schemas.openxmlformats.org/markup-compatibility/2006" xmlns:aink="http://schemas.microsoft.com/office/drawing/2016/ink" xmlns:am3d="http://schemas.microsoft.com/office/drawing/2017/model3d" xmlns:o="urn:schemas-microsoft-com:office:office" xmlns:oel="http://schemas.microsoft.com/office/2019/extlst" xmlns:r="http://schemas.openxmlformats.org/officeDocument/2006/relationships" xmlns:m="http://schemas.openxmlformats.org/officeDocument/2006/math" xmlns:v="urn:schemas-microsoft-com:vml" xmlns:wp14="http://schemas.microsoft.com/office/word/2010/wordprocessingDrawing" xmlns:wp="http://schemas.openxmlformats.org/drawingml/2006/wordprocessingDrawing" xmlns:w10="urn:schemas-microsoft-com:office:word" xmlns:w="http://schemas.openxmlformats.org/wordprocessingml/2006/main" xmlns:w14="http://schemas.microsoft.com/office/word/2010/wordml" xmlns:w15="http://schemas.microsoft.com/office/word/2012/wordml" xmlns:w16cex="http://schemas.microsoft.com/office/word/2018/wordml/cex" xmlns:w16cid="http://schemas.microsoft.com/office/word/2016/wordml/cid" xmlns:w16="http://schemas.microsoft.com/office/word/2018/wordml" xmlns:w16sdtdh="http://schemas.microsoft.com/office/word/2020/wordml/sdtdatahash" xmlns:w16se="http://schemas.microsoft.com/office/word/2015/wordml/symex" xmlns:wpg="http://schemas.microsoft.com/office/word/2010/wordprocessingGroup" xmlns:wpi="http://schemas.microsoft.com/office/word/2010/wordprocessingInk" xmlns:wne="http://schemas.microsoft.com/office/word/2006/wordml" xmlns:wps="http://schemas.microsoft.com/office/word/2010/wordprocessingShape" mc:Ignorable="w14 w15 w16se w16cid w16 w16cex w16sdtdh wp14">
+<w:numbering xmlns:wpc="http://schemas.microsoft.com/office/word/2010/wordprocessingCanvas" xmlns:cx="http://schemas.microsoft.com/office/drawing/2014/chartex" xmlns:cx1="http://schemas.microsoft.com/office/drawing/2015/9/8/chartex" xmlns:cx2="http://schemas.microsoft.com/office/drawing/2015/10/21/chartex" xmlns:cx3="http://schemas.microsoft.com/office/drawing/2016/5/9/chartex" xmlns:cx4="http://schemas.microsoft.com/office/drawing/2016/5/10/chartex" xmlns:cx5="http://schemas.microsoft.com/office/drawing/2016/5/11/chartex" xmlns:cx6="http://schemas.microsoft.com/office/drawing/2016/5/12/chartex" xmlns:cx7="http://schemas.microsoft.com/office/drawing/2016/5/13/chartex" xmlns:cx8="http://schemas.microsoft.com/office/drawing/2016/5/14/chartex" xmlns:mc="http://schemas.openxmlformats.org/markup-compatibility/2006" xmlns:aink="http://schemas.microsoft.com/office/drawing/2016/ink" xmlns:am3d="http://schemas.microsoft.com/office/drawing/2017/model3d" xmlns:o="urn:schemas-microsoft-com:office:office" xmlns:oel="http://schemas.microsoft.com/office/2019/extlst" xmlns:r="http://schemas.openxmlformats.org/officeDocument/2006/relationships" xmlns:m="http://schemas.openxmlformats.org/officeDocument/2006/math" xmlns:v="urn:schemas-microsoft-com:vml" xmlns:wp14="http://schemas.microsoft.com/office/word/2010/wordprocessingDrawing" xmlns:wp="http://schemas.openxmlformats.org/drawingml/2006/wordprocessingDrawing" xmlns:w10="urn:schemas-microsoft-com:office:word" xmlns:w="http://schemas.openxmlformats.org/wordprocessingml/2006/main" xmlns:w14="http://schemas.microsoft.com/office/word/2010/wordml" xmlns:w15="http://schemas.microsoft.com/office/word/2012/wordml" xmlns:w16cex="http://schemas.microsoft.com/office/word/2018/wordml/cex" xmlns:w16cid="http://schemas.microsoft.com/office/word/2016/wordml/cid" xmlns:w16="http://schemas.microsoft.com/office/word/2018/wordml" xmlns:w16du="http://schemas.microsoft.com/office/word/2023/wordml/word16du" xmlns:w16sdtdh="http://schemas.microsoft.com/office/word/2020/wordml/sdtdatahash" xmlns:w16sdtfl="http://schemas.microsoft.com/office/word/2024/wordml/sdtformatlock" xmlns:w16se="http://schemas.microsoft.com/office/word/2015/wordml/symex" xmlns:wpg="http://schemas.microsoft.com/office/word/2010/wordprocessingGroup" xmlns:wpi="http://schemas.microsoft.com/office/word/2010/wordprocessingInk" xmlns:wne="http://schemas.microsoft.com/office/word/2006/wordml" xmlns:wps="http://schemas.microsoft.com/office/word/2010/wordprocessingShape" mc:Ignorable="w14 w15 w16se w16cid w16 w16cex w16sdtdh w16sdtfl w16du wp14">
   <w:abstractNum w:abstractNumId="0" w15:restartNumberingAfterBreak="0">
     <w:nsid w:val="EA454B4C"/>
     <w:multiLevelType w:val="multilevel"/>
@@ -3424,7 +3435,7 @@
 </file>
 
 <file path=word/styles.xml><?xml version="1.0" encoding="utf-8"?>
-<w:styles xmlns:mc="http://schemas.openxmlformats.org/markup-compatibility/2006" xmlns:r="http://schemas.openxmlformats.org/officeDocument/2006/relationships" xmlns:w="http://schemas.openxmlformats.org/wordprocessingml/2006/main" xmlns:w14="http://schemas.microsoft.com/office/word/2010/wordml" xmlns:w15="http://schemas.microsoft.com/office/word/2012/wordml" xmlns:w16cex="http://schemas.microsoft.com/office/word/2018/wordml/cex" xmlns:w16cid="http://schemas.microsoft.com/office/word/2016/wordml/cid" xmlns:w16="http://schemas.microsoft.com/office/word/2018/wordml" xmlns:w16sdtdh="http://schemas.microsoft.com/office/word/2020/wordml/sdtdatahash" xmlns:w16se="http://schemas.microsoft.com/office/word/2015/wordml/symex" mc:Ignorable="w14 w15 w16se w16cid w16 w16cex w16sdtdh">
+<w:styles xmlns:mc="http://schemas.openxmlformats.org/markup-compatibility/2006" xmlns:r="http://schemas.openxmlformats.org/officeDocument/2006/relationships" xmlns:w="http://schemas.openxmlformats.org/wordprocessingml/2006/main" xmlns:w14="http://schemas.microsoft.com/office/word/2010/wordml" xmlns:w15="http://schemas.microsoft.com/office/word/2012/wordml" xmlns:w16cex="http://schemas.microsoft.com/office/word/2018/wordml/cex" xmlns:w16cid="http://schemas.microsoft.com/office/word/2016/wordml/cid" xmlns:w16="http://schemas.microsoft.com/office/word/2018/wordml" xmlns:w16du="http://schemas.microsoft.com/office/word/2023/wordml/word16du" xmlns:w16sdtdh="http://schemas.microsoft.com/office/word/2020/wordml/sdtdatahash" xmlns:w16sdtfl="http://schemas.microsoft.com/office/word/2024/wordml/sdtformatlock" xmlns:w16se="http://schemas.microsoft.com/office/word/2015/wordml/symex" mc:Ignorable="w14 w15 w16se w16cid w16 w16cex w16sdtdh w16sdtfl w16du">
   <w:docDefaults>
     <w:rPrDefault>
       <w:rPr>

</xml_diff>

<commit_message>
Add zotero citation to the test book
</commit_message>
<xml_diff>
--- a/tests/_fixtures/a_book/00_index.docx
+++ b/tests/_fixtures/a_book/00_index.docx
@@ -346,7 +346,31 @@
         <w:t>ontent.</w:t>
       </w:r>
       <w:r>
-        <w:t xml:space="preserve"> An example of an image is placed below.</w:t>
+        <w:t xml:space="preserve"> An example of an image is placed below</w:t>
+      </w:r>
+      <w:r>
+        <w:t xml:space="preserve"> </w:t>
+      </w:r>
+      <w:r>
+        <w:fldChar w:fldCharType="begin"/>
+      </w:r>
+      <w:r>
+        <w:instrText xml:space="preserve"> ADDIN ZOTERO_ITEM CSL_CITATION {"citationID":"MQAb9y5G","properties":{"formattedCitation":"(Jay 2004)","plainCitation":"(Jay 2004)","noteIndex":0},"citationItems":[{"id":3,"uris":["http://zotero.org/users/local/bv74ArEQ/items/KKITI438"],"itemData":{"id":3,"type":"book","abstract":"The title says it all. Break out the crayons, 'cause it gangsta rap coloring time! 48 pages of line drawings of \"Gangsta\" rappers, done with the thick black line we all remember from the coloring books of our youth. The juxtaposition of the outlaw image of the rappers with the childlike innocence of a coloring book makes for an instant laugh.","ISBN":"9780867196047","number-of-pages":"50","publisher":"Last Gasp","title":"Gangsta Rap Coloring Book","author":[{"family":"Jay","given":"Aye"}],"issued":{"date-parts":[["2004",4,1]]}}}],"schema":"https://github.com/citation-style-language/schema/raw/master/csl-citation.json"} </w:instrText>
+      </w:r>
+      <w:r>
+        <w:fldChar w:fldCharType="separate"/>
+      </w:r>
+      <w:r>
+        <w:rPr>
+          <w:rFonts w:ascii="Cambria" w:hAnsi="Cambria"/>
+        </w:rPr>
+        <w:t>(Jay 2004)</w:t>
+      </w:r>
+      <w:r>
+        <w:fldChar w:fldCharType="end"/>
+      </w:r>
+      <w:r>
+        <w:t>.</w:t>
       </w:r>
     </w:p>
     <w:p>
@@ -3975,7 +3999,6 @@
   <w:style w:type="character" w:default="1" w:styleId="DefaultParagraphFont">
     <w:name w:val="Default Paragraph Font"/>
     <w:uiPriority w:val="1"/>
-    <w:semiHidden/>
     <w:unhideWhenUsed/>
   </w:style>
   <w:style w:type="table" w:default="1" w:styleId="TableNormal">

</xml_diff>

<commit_message>
Add height column to assets
</commit_message>
<xml_diff>
--- a/tests/_fixtures/a_book/00_index.docx
+++ b/tests/_fixtures/a_book/00_index.docx
@@ -808,6 +808,85 @@
           </w:p>
         </w:tc>
       </w:tr>
+      <w:tr>
+        <w:trPr>
+          <w:trHeight w:val="300"/>
+        </w:trPr>
+        <w:tc>
+          <w:tcPr>
+            <w:tcW w:w="1345" w:type="dxa"/>
+            <w:shd w:val="clear" w:color="auto" w:fill="auto"/>
+            <w:vAlign w:val="center"/>
+          </w:tcPr>
+          <w:p>
+            <w:pPr>
+              <w:spacing w:after="0"/>
+              <w:textAlignment w:val="baseline"/>
+              <w:rPr>
+                <w:rFonts w:ascii="Calibri" w:eastAsia="Times New Roman" w:hAnsi="Calibri" w:cs="Calibri"/>
+                <w:sz w:val="16"/>
+                <w:szCs w:val="16"/>
+                <w:lang w:val="fr-FR"/>
+              </w:rPr>
+            </w:pPr>
+            <w:r>
+              <w:rPr>
+                <w:rFonts w:ascii="Calibri" w:eastAsia="Times New Roman" w:hAnsi="Calibri" w:cs="Calibri"/>
+                <w:sz w:val="16"/>
+                <w:szCs w:val="16"/>
+                <w:lang w:val="fr-FR"/>
+              </w:rPr>
+              <w:t xml:space="preserve">## </w:t>
+            </w:r>
+            <w:proofErr w:type="spellStart"/>
+            <w:r>
+              <w:rPr>
+                <w:rFonts w:ascii="Calibri" w:eastAsia="Times New Roman" w:hAnsi="Calibri" w:cs="Calibri"/>
+                <w:sz w:val="16"/>
+                <w:szCs w:val="16"/>
+                <w:lang w:val="fr-FR"/>
+              </w:rPr>
+              <w:t>H</w:t>
+            </w:r>
+            <w:r>
+              <w:rPr>
+                <w:rFonts w:ascii="Calibri" w:eastAsia="Times New Roman" w:hAnsi="Calibri" w:cs="Calibri"/>
+                <w:sz w:val="16"/>
+                <w:szCs w:val="16"/>
+                <w:lang w:val="fr-FR"/>
+              </w:rPr>
+              <w:t>eight</w:t>
+            </w:r>
+            <w:proofErr w:type="spellEnd"/>
+          </w:p>
+        </w:tc>
+        <w:tc>
+          <w:tcPr>
+            <w:tcW w:w="8000" w:type="dxa"/>
+            <w:shd w:val="clear" w:color="auto" w:fill="auto"/>
+            <w:vAlign w:val="center"/>
+          </w:tcPr>
+          <w:p>
+            <w:pPr>
+              <w:spacing w:after="0"/>
+              <w:textAlignment w:val="baseline"/>
+              <w:rPr>
+                <w:rFonts w:ascii="Calibri" w:eastAsia="Times New Roman" w:hAnsi="Calibri" w:cs="Calibri"/>
+                <w:sz w:val="16"/>
+                <w:szCs w:val="16"/>
+              </w:rPr>
+            </w:pPr>
+            <w:r>
+              <w:rPr>
+                <w:rFonts w:ascii="Calibri" w:eastAsia="Times New Roman" w:hAnsi="Calibri" w:cs="Calibri"/>
+                <w:sz w:val="16"/>
+                <w:szCs w:val="16"/>
+              </w:rPr>
+              <w:t>120%</w:t>
+            </w:r>
+          </w:p>
+        </w:tc>
+      </w:tr>
     </w:tbl>
     <w:p>
       <w:pPr>
@@ -3999,6 +4078,7 @@
   <w:style w:type="character" w:default="1" w:styleId="DefaultParagraphFont">
     <w:name w:val="Default Paragraph Font"/>
     <w:uiPriority w:val="1"/>
+    <w:semiHidden/>
     <w:unhideWhenUsed/>
   </w:style>
   <w:style w:type="table" w:default="1" w:styleId="TableNormal">

</xml_diff>

<commit_message>
Add frontmatter to the index page
</commit_message>
<xml_diff>
--- a/tests/_fixtures/a_book/00_index.docx
+++ b/tests/_fixtures/a_book/00_index.docx
@@ -2,6 +2,519 @@
 <file path=word/document.xml><?xml version="1.0" encoding="utf-8"?>
 <w:document xmlns:wpc="http://schemas.microsoft.com/office/word/2010/wordprocessingCanvas" xmlns:cx="http://schemas.microsoft.com/office/drawing/2014/chartex" xmlns:cx1="http://schemas.microsoft.com/office/drawing/2015/9/8/chartex" xmlns:cx2="http://schemas.microsoft.com/office/drawing/2015/10/21/chartex" xmlns:cx3="http://schemas.microsoft.com/office/drawing/2016/5/9/chartex" xmlns:cx4="http://schemas.microsoft.com/office/drawing/2016/5/10/chartex" xmlns:cx5="http://schemas.microsoft.com/office/drawing/2016/5/11/chartex" xmlns:cx6="http://schemas.microsoft.com/office/drawing/2016/5/12/chartex" xmlns:cx7="http://schemas.microsoft.com/office/drawing/2016/5/13/chartex" xmlns:cx8="http://schemas.microsoft.com/office/drawing/2016/5/14/chartex" xmlns:mc="http://schemas.openxmlformats.org/markup-compatibility/2006" xmlns:aink="http://schemas.microsoft.com/office/drawing/2016/ink" xmlns:am3d="http://schemas.microsoft.com/office/drawing/2017/model3d" xmlns:o="urn:schemas-microsoft-com:office:office" xmlns:oel="http://schemas.microsoft.com/office/2019/extlst" xmlns:r="http://schemas.openxmlformats.org/officeDocument/2006/relationships" xmlns:m="http://schemas.openxmlformats.org/officeDocument/2006/math" xmlns:v="urn:schemas-microsoft-com:vml" xmlns:wp14="http://schemas.microsoft.com/office/word/2010/wordprocessingDrawing" xmlns:wp="http://schemas.openxmlformats.org/drawingml/2006/wordprocessingDrawing" xmlns:w10="urn:schemas-microsoft-com:office:word" xmlns:w="http://schemas.openxmlformats.org/wordprocessingml/2006/main" xmlns:w14="http://schemas.microsoft.com/office/word/2010/wordml" xmlns:w15="http://schemas.microsoft.com/office/word/2012/wordml" xmlns:w16cex="http://schemas.microsoft.com/office/word/2018/wordml/cex" xmlns:w16cid="http://schemas.microsoft.com/office/word/2016/wordml/cid" xmlns:w16="http://schemas.microsoft.com/office/word/2018/wordml" xmlns:w16du="http://schemas.microsoft.com/office/word/2023/wordml/word16du" xmlns:w16sdtdh="http://schemas.microsoft.com/office/word/2020/wordml/sdtdatahash" xmlns:w16sdtfl="http://schemas.microsoft.com/office/word/2024/wordml/sdtformatlock" xmlns:w16se="http://schemas.microsoft.com/office/word/2015/wordml/symex" xmlns:wpg="http://schemas.microsoft.com/office/word/2010/wordprocessingGroup" xmlns:wpi="http://schemas.microsoft.com/office/word/2010/wordprocessingInk" xmlns:wne="http://schemas.microsoft.com/office/word/2006/wordml" xmlns:wps="http://schemas.microsoft.com/office/word/2010/wordprocessingShape" mc:Ignorable="w14 w15 w16se w16cid w16 w16cex w16sdtdh w16sdtfl w16du wp14">
   <w:body>
+    <w:p/>
+    <w:tbl>
+      <w:tblPr>
+        <w:tblStyle w:val="PlainTable5"/>
+        <w:tblW w:w="0" w:type="auto"/>
+        <w:tblLook w:val="04A0" w:firstRow="1" w:lastRow="0" w:firstColumn="1" w:lastColumn="0" w:noHBand="0" w:noVBand="1"/>
+      </w:tblPr>
+      <w:tblGrid>
+        <w:gridCol w:w="1525"/>
+        <w:gridCol w:w="7825"/>
+      </w:tblGrid>
+      <w:tr>
+        <w:trPr>
+          <w:cnfStyle w:val="100000000000" w:firstRow="1" w:lastRow="0" w:firstColumn="0" w:lastColumn="0" w:oddVBand="0" w:evenVBand="0" w:oddHBand="0" w:evenHBand="0" w:firstRowFirstColumn="0" w:firstRowLastColumn="0" w:lastRowFirstColumn="0" w:lastRowLastColumn="0"/>
+        </w:trPr>
+        <w:tc>
+          <w:tcPr>
+            <w:cnfStyle w:val="001000000100" w:firstRow="0" w:lastRow="0" w:firstColumn="1" w:lastColumn="0" w:oddVBand="0" w:evenVBand="0" w:oddHBand="0" w:evenHBand="0" w:firstRowFirstColumn="1" w:firstRowLastColumn="0" w:lastRowFirstColumn="0" w:lastRowLastColumn="0"/>
+            <w:tcW w:w="1525" w:type="dxa"/>
+          </w:tcPr>
+          <w:p>
+            <w:pPr>
+              <w:pStyle w:val="Frontmatter"/>
+            </w:pPr>
+          </w:p>
+        </w:tc>
+        <w:tc>
+          <w:tcPr>
+            <w:tcW w:w="7825" w:type="dxa"/>
+          </w:tcPr>
+          <w:p>
+            <w:pPr>
+              <w:pStyle w:val="Frontmatter"/>
+              <w:cnfStyle w:val="100000000000" w:firstRow="1" w:lastRow="0" w:firstColumn="0" w:lastColumn="0" w:oddVBand="0" w:evenVBand="0" w:oddHBand="0" w:evenHBand="0" w:firstRowFirstColumn="0" w:firstRowLastColumn="0" w:lastRowFirstColumn="0" w:lastRowLastColumn="0"/>
+            </w:pPr>
+            <w:r>
+              <w:t>Frontmatter</w:t>
+            </w:r>
+          </w:p>
+        </w:tc>
+      </w:tr>
+      <w:tr>
+        <w:trPr>
+          <w:cnfStyle w:val="000000100000" w:firstRow="0" w:lastRow="0" w:firstColumn="0" w:lastColumn="0" w:oddVBand="0" w:evenVBand="0" w:oddHBand="1" w:evenHBand="0" w:firstRowFirstColumn="0" w:firstRowLastColumn="0" w:lastRowFirstColumn="0" w:lastRowLastColumn="0"/>
+        </w:trPr>
+        <w:tc>
+          <w:tcPr>
+            <w:cnfStyle w:val="001000000000" w:firstRow="0" w:lastRow="0" w:firstColumn="1" w:lastColumn="0" w:oddVBand="0" w:evenVBand="0" w:oddHBand="0" w:evenHBand="0" w:firstRowFirstColumn="0" w:firstRowLastColumn="0" w:lastRowFirstColumn="0" w:lastRowLastColumn="0"/>
+            <w:tcW w:w="1525" w:type="dxa"/>
+          </w:tcPr>
+          <w:p>
+            <w:pPr>
+              <w:pStyle w:val="Frontmatter"/>
+            </w:pPr>
+            <w:r>
+              <w:t>title</w:t>
+            </w:r>
+          </w:p>
+        </w:tc>
+        <w:tc>
+          <w:tcPr>
+            <w:tcW w:w="7825" w:type="dxa"/>
+          </w:tcPr>
+          <w:p>
+            <w:pPr>
+              <w:pStyle w:val="Frontmatter"/>
+              <w:cnfStyle w:val="000000100000" w:firstRow="0" w:lastRow="0" w:firstColumn="0" w:lastColumn="0" w:oddVBand="0" w:evenVBand="0" w:oddHBand="1" w:evenHBand="0" w:firstRowFirstColumn="0" w:firstRowLastColumn="0" w:lastRowFirstColumn="0" w:lastRowLastColumn="0"/>
+            </w:pPr>
+            <w:r>
+              <w:t>Just a book</w:t>
+            </w:r>
+          </w:p>
+        </w:tc>
+      </w:tr>
+      <w:tr>
+        <w:tc>
+          <w:tcPr>
+            <w:cnfStyle w:val="001000000000" w:firstRow="0" w:lastRow="0" w:firstColumn="1" w:lastColumn="0" w:oddVBand="0" w:evenVBand="0" w:oddHBand="0" w:evenHBand="0" w:firstRowFirstColumn="0" w:firstRowLastColumn="0" w:lastRowFirstColumn="0" w:lastRowLastColumn="0"/>
+            <w:tcW w:w="1525" w:type="dxa"/>
+          </w:tcPr>
+          <w:p>
+            <w:pPr>
+              <w:pStyle w:val="Frontmatter"/>
+            </w:pPr>
+            <w:r>
+              <w:t>authors</w:t>
+            </w:r>
+          </w:p>
+        </w:tc>
+        <w:tc>
+          <w:tcPr>
+            <w:tcW w:w="7825" w:type="dxa"/>
+          </w:tcPr>
+          <w:p>
+            <w:pPr>
+              <w:pStyle w:val="Frontmatter"/>
+              <w:numPr>
+                <w:ilvl w:val="0"/>
+                <w:numId w:val="45"/>
+              </w:numPr>
+              <w:cnfStyle w:val="000000000000" w:firstRow="0" w:lastRow="0" w:firstColumn="0" w:lastColumn="0" w:oddVBand="0" w:evenVBand="0" w:oddHBand="0" w:evenHBand="0" w:firstRowFirstColumn="0" w:firstRowLastColumn="0" w:lastRowFirstColumn="0" w:lastRowLastColumn="0"/>
+            </w:pPr>
+            <w:r>
+              <w:t>{name: Pawel Kaminski, affiliations: University of Luxembourg}</w:t>
+            </w:r>
+          </w:p>
+          <w:p>
+            <w:pPr>
+              <w:pStyle w:val="Frontmatter"/>
+              <w:numPr>
+                <w:ilvl w:val="0"/>
+                <w:numId w:val="45"/>
+              </w:numPr>
+              <w:cnfStyle w:val="000000000000" w:firstRow="0" w:lastRow="0" w:firstColumn="0" w:lastColumn="0" w:oddVBand="0" w:evenVBand="0" w:oddHBand="0" w:evenHBand="0" w:firstRowFirstColumn="0" w:firstRowLastColumn="0" w:lastRowFirstColumn="0" w:lastRowLastColumn="0"/>
+            </w:pPr>
+            <w:r>
+              <w:t xml:space="preserve">{name: </w:t>
+            </w:r>
+            <w:r>
+              <w:t xml:space="preserve">Elisabeth </w:t>
+            </w:r>
+            <w:r>
+              <w:t>Guerard</w:t>
+            </w:r>
+            <w:r>
+              <w:t xml:space="preserve">, affiliations: </w:t>
+            </w:r>
+            <w:r>
+              <w:t>Luxembourg Centre for Contemporary and Digital History (C²DH)</w:t>
+            </w:r>
+            <w:r>
+              <w:t>}</w:t>
+            </w:r>
+          </w:p>
+        </w:tc>
+      </w:tr>
+      <w:tr>
+        <w:trPr>
+          <w:cnfStyle w:val="000000100000" w:firstRow="0" w:lastRow="0" w:firstColumn="0" w:lastColumn="0" w:oddVBand="0" w:evenVBand="0" w:oddHBand="1" w:evenHBand="0" w:firstRowFirstColumn="0" w:firstRowLastColumn="0" w:lastRowFirstColumn="0" w:lastRowLastColumn="0"/>
+        </w:trPr>
+        <w:tc>
+          <w:tcPr>
+            <w:cnfStyle w:val="001000000000" w:firstRow="0" w:lastRow="0" w:firstColumn="1" w:lastColumn="0" w:oddVBand="0" w:evenVBand="0" w:oddHBand="0" w:evenHBand="0" w:firstRowFirstColumn="0" w:firstRowLastColumn="0" w:lastRowFirstColumn="0" w:lastRowLastColumn="0"/>
+            <w:tcW w:w="1525" w:type="dxa"/>
+          </w:tcPr>
+          <w:p>
+            <w:pPr>
+              <w:pStyle w:val="Frontmatter"/>
+            </w:pPr>
+            <w:proofErr w:type="spellStart"/>
+            <w:r>
+              <w:t>isbn</w:t>
+            </w:r>
+            <w:proofErr w:type="spellEnd"/>
+          </w:p>
+        </w:tc>
+        <w:tc>
+          <w:tcPr>
+            <w:tcW w:w="7825" w:type="dxa"/>
+          </w:tcPr>
+          <w:p>
+            <w:pPr>
+              <w:pStyle w:val="Frontmatter"/>
+              <w:cnfStyle w:val="000000100000" w:firstRow="0" w:lastRow="0" w:firstColumn="0" w:lastColumn="0" w:oddVBand="0" w:evenVBand="0" w:oddHBand="1" w:evenHBand="0" w:firstRowFirstColumn="0" w:firstRowLastColumn="0" w:lastRowFirstColumn="0" w:lastRowLastColumn="0"/>
+            </w:pPr>
+            <w:r>
+              <w:t>{</w:t>
+            </w:r>
+            <w:proofErr w:type="spellStart"/>
+            <w:r>
+              <w:t>ebook</w:t>
+            </w:r>
+            <w:proofErr w:type="spellEnd"/>
+            <w:r>
+              <w:t>: 9876543210123, hardcover: 9876543210123, paperback: 9876543210123}</w:t>
+            </w:r>
+          </w:p>
+        </w:tc>
+      </w:tr>
+      <w:tr>
+        <w:tc>
+          <w:tcPr>
+            <w:cnfStyle w:val="001000000000" w:firstRow="0" w:lastRow="0" w:firstColumn="1" w:lastColumn="0" w:oddVBand="0" w:evenVBand="0" w:oddHBand="0" w:evenHBand="0" w:firstRowFirstColumn="0" w:firstRowLastColumn="0" w:lastRowFirstColumn="0" w:lastRowLastColumn="0"/>
+            <w:tcW w:w="1525" w:type="dxa"/>
+          </w:tcPr>
+          <w:p>
+            <w:pPr>
+              <w:pStyle w:val="Frontmatter"/>
+            </w:pPr>
+            <w:r>
+              <w:t>keywords</w:t>
+            </w:r>
+          </w:p>
+        </w:tc>
+        <w:tc>
+          <w:tcPr>
+            <w:tcW w:w="7825" w:type="dxa"/>
+          </w:tcPr>
+          <w:p>
+            <w:pPr>
+              <w:pStyle w:val="Frontmatter"/>
+              <w:numPr>
+                <w:ilvl w:val="0"/>
+                <w:numId w:val="44"/>
+              </w:numPr>
+              <w:cnfStyle w:val="000000000000" w:firstRow="0" w:lastRow="0" w:firstColumn="0" w:lastColumn="0" w:oddVBand="0" w:evenVBand="0" w:oddHBand="0" w:evenHBand="0" w:firstRowFirstColumn="0" w:firstRowLastColumn="0" w:lastRowFirstColumn="0" w:lastRowLastColumn="0"/>
+            </w:pPr>
+            <w:r>
+              <w:t>test</w:t>
+            </w:r>
+          </w:p>
+          <w:p>
+            <w:pPr>
+              <w:pStyle w:val="Frontmatter"/>
+              <w:numPr>
+                <w:ilvl w:val="0"/>
+                <w:numId w:val="44"/>
+              </w:numPr>
+              <w:cnfStyle w:val="000000000000" w:firstRow="0" w:lastRow="0" w:firstColumn="0" w:lastColumn="0" w:oddVBand="0" w:evenVBand="0" w:oddHBand="0" w:evenHBand="0" w:firstRowFirstColumn="0" w:firstRowLastColumn="0" w:lastRowFirstColumn="0" w:lastRowLastColumn="0"/>
+            </w:pPr>
+            <w:r>
+              <w:t>e2e</w:t>
+            </w:r>
+          </w:p>
+        </w:tc>
+      </w:tr>
+      <w:tr>
+        <w:trPr>
+          <w:cnfStyle w:val="000000100000" w:firstRow="0" w:lastRow="0" w:firstColumn="0" w:lastColumn="0" w:oddVBand="0" w:evenVBand="0" w:oddHBand="1" w:evenHBand="0" w:firstRowFirstColumn="0" w:firstRowLastColumn="0" w:lastRowFirstColumn="0" w:lastRowLastColumn="0"/>
+        </w:trPr>
+        <w:tc>
+          <w:tcPr>
+            <w:cnfStyle w:val="001000000000" w:firstRow="0" w:lastRow="0" w:firstColumn="1" w:lastColumn="0" w:oddVBand="0" w:evenVBand="0" w:oddHBand="0" w:evenHBand="0" w:firstRowFirstColumn="0" w:firstRowLastColumn="0" w:lastRowFirstColumn="0" w:lastRowLastColumn="0"/>
+            <w:tcW w:w="1525" w:type="dxa"/>
+          </w:tcPr>
+          <w:p>
+            <w:pPr>
+              <w:pStyle w:val="Frontmatter"/>
+            </w:pPr>
+            <w:proofErr w:type="spellStart"/>
+            <w:r>
+              <w:t>open_access</w:t>
+            </w:r>
+            <w:proofErr w:type="spellEnd"/>
+          </w:p>
+        </w:tc>
+        <w:tc>
+          <w:tcPr>
+            <w:tcW w:w="7825" w:type="dxa"/>
+          </w:tcPr>
+          <w:p>
+            <w:pPr>
+              <w:pStyle w:val="Frontmatter"/>
+              <w:cnfStyle w:val="000000100000" w:firstRow="0" w:lastRow="0" w:firstColumn="0" w:lastColumn="0" w:oddVBand="0" w:evenVBand="0" w:oddHBand="1" w:evenHBand="0" w:firstRowFirstColumn="0" w:firstRowLastColumn="0" w:lastRowFirstColumn="0" w:lastRowLastColumn="0"/>
+            </w:pPr>
+            <w:r>
+              <w:t>True</w:t>
+            </w:r>
+          </w:p>
+        </w:tc>
+      </w:tr>
+      <w:tr>
+        <w:tc>
+          <w:tcPr>
+            <w:cnfStyle w:val="001000000000" w:firstRow="0" w:lastRow="0" w:firstColumn="1" w:lastColumn="0" w:oddVBand="0" w:evenVBand="0" w:oddHBand="0" w:evenHBand="0" w:firstRowFirstColumn="0" w:firstRowLastColumn="0" w:lastRowFirstColumn="0" w:lastRowLastColumn="0"/>
+            <w:tcW w:w="1525" w:type="dxa"/>
+          </w:tcPr>
+          <w:p>
+            <w:pPr>
+              <w:pStyle w:val="Frontmatter"/>
+            </w:pPr>
+            <w:r>
+              <w:t>license</w:t>
+            </w:r>
+          </w:p>
+        </w:tc>
+        <w:tc>
+          <w:tcPr>
+            <w:tcW w:w="7825" w:type="dxa"/>
+          </w:tcPr>
+          <w:p>
+            <w:pPr>
+              <w:pStyle w:val="Frontmatter"/>
+              <w:cnfStyle w:val="000000000000" w:firstRow="0" w:lastRow="0" w:firstColumn="0" w:lastColumn="0" w:oddVBand="0" w:evenVBand="0" w:oddHBand="0" w:evenHBand="0" w:firstRowFirstColumn="0" w:firstRowLastColumn="0" w:lastRowFirstColumn="0" w:lastRowLastColumn="0"/>
+            </w:pPr>
+            <w:r>
+              <w:t>CC-BY-NC-ND-4.0</w:t>
+            </w:r>
+          </w:p>
+        </w:tc>
+      </w:tr>
+      <w:tr>
+        <w:trPr>
+          <w:cnfStyle w:val="000000100000" w:firstRow="0" w:lastRow="0" w:firstColumn="0" w:lastColumn="0" w:oddVBand="0" w:evenVBand="0" w:oddHBand="1" w:evenHBand="0" w:firstRowFirstColumn="0" w:firstRowLastColumn="0" w:lastRowFirstColumn="0" w:lastRowLastColumn="0"/>
+        </w:trPr>
+        <w:tc>
+          <w:tcPr>
+            <w:cnfStyle w:val="001000000000" w:firstRow="0" w:lastRow="0" w:firstColumn="1" w:lastColumn="0" w:oddVBand="0" w:evenVBand="0" w:oddHBand="0" w:evenHBand="0" w:firstRowFirstColumn="0" w:firstRowLastColumn="0" w:lastRowFirstColumn="0" w:lastRowLastColumn="0"/>
+            <w:tcW w:w="1525" w:type="dxa"/>
+          </w:tcPr>
+          <w:p>
+            <w:pPr>
+              <w:pStyle w:val="Frontmatter"/>
+            </w:pPr>
+            <w:proofErr w:type="spellStart"/>
+            <w:r>
+              <w:t>github</w:t>
+            </w:r>
+            <w:proofErr w:type="spellEnd"/>
+          </w:p>
+        </w:tc>
+        <w:tc>
+          <w:tcPr>
+            <w:tcW w:w="7825" w:type="dxa"/>
+          </w:tcPr>
+          <w:p>
+            <w:pPr>
+              <w:pStyle w:val="Frontmatter"/>
+              <w:cnfStyle w:val="000000100000" w:firstRow="0" w:lastRow="0" w:firstColumn="0" w:lastColumn="0" w:oddVBand="0" w:evenVBand="0" w:oddHBand="1" w:evenHBand="0" w:firstRowFirstColumn="0" w:firstRowLastColumn="0" w:lastRowFirstColumn="0" w:lastRowLastColumn="0"/>
+            </w:pPr>
+            <w:r>
+              <w:t>https://github.com/monograph-prototypes/split-to-multiple-chapters</w:t>
+            </w:r>
+          </w:p>
+        </w:tc>
+      </w:tr>
+    </w:tbl>
+    <w:p/>
+    <w:p/>
+    <w:p>
+      <w:pPr>
+        <w:pStyle w:val="Frontmatter"/>
+      </w:pPr>
+      <w:r>
+        <w:t>---</w:t>
+      </w:r>
+    </w:p>
+    <w:p>
+      <w:pPr>
+        <w:pStyle w:val="Frontmatter"/>
+      </w:pPr>
+      <w:r>
+        <w:t>t</w:t>
+      </w:r>
+      <w:r>
+        <w:t>itle</w:t>
+      </w:r>
+      <w:r>
+        <w:t>: Just a book</w:t>
+      </w:r>
+    </w:p>
+    <w:p>
+      <w:pPr>
+        <w:pStyle w:val="Frontmatter"/>
+      </w:pPr>
+      <w:r>
+        <w:t>author</w:t>
+      </w:r>
+      <w:r>
+        <w:t>s</w:t>
+      </w:r>
+      <w:r>
+        <w:t>:</w:t>
+      </w:r>
+    </w:p>
+    <w:p>
+      <w:pPr>
+        <w:pStyle w:val="Frontmatter"/>
+      </w:pPr>
+      <w:r>
+        <w:t xml:space="preserve">  </w:t>
+      </w:r>
+      <w:r>
+        <w:t xml:space="preserve">- name: </w:t>
+      </w:r>
+      <w:r>
+        <w:t>Pawel Kaminski</w:t>
+      </w:r>
+    </w:p>
+    <w:p>
+      <w:pPr>
+        <w:pStyle w:val="Frontmatter"/>
+      </w:pPr>
+      <w:r>
+        <w:t xml:space="preserve">    affiliations: University of Luxembourg</w:t>
+      </w:r>
+    </w:p>
+    <w:p>
+      <w:pPr>
+        <w:pStyle w:val="Frontmatter"/>
+      </w:pPr>
+      <w:proofErr w:type="spellStart"/>
+      <w:r>
+        <w:t>isbn</w:t>
+      </w:r>
+      <w:proofErr w:type="spellEnd"/>
+      <w:r>
+        <w:t>:</w:t>
+      </w:r>
+    </w:p>
+    <w:p>
+      <w:pPr>
+        <w:pStyle w:val="Frontmatter"/>
+      </w:pPr>
+      <w:r>
+        <w:t xml:space="preserve">  - </w:t>
+      </w:r>
+      <w:proofErr w:type="spellStart"/>
+      <w:r>
+        <w:t>ebook</w:t>
+      </w:r>
+      <w:proofErr w:type="spellEnd"/>
+      <w:r>
+        <w:t>: 9876543210123</w:t>
+      </w:r>
+    </w:p>
+    <w:p>
+      <w:pPr>
+        <w:pStyle w:val="Frontmatter"/>
+      </w:pPr>
+      <w:r>
+        <w:t xml:space="preserve">    hardcover: 9876543210123</w:t>
+      </w:r>
+    </w:p>
+    <w:p>
+      <w:pPr>
+        <w:pStyle w:val="Frontmatter"/>
+      </w:pPr>
+      <w:r>
+        <w:t xml:space="preserve">    paperback: 9876543210123</w:t>
+      </w:r>
+    </w:p>
+    <w:p>
+      <w:pPr>
+        <w:pStyle w:val="Frontmatter"/>
+      </w:pPr>
+      <w:r>
+        <w:t>keywords</w:t>
+      </w:r>
+      <w:r>
+        <w:t>:</w:t>
+      </w:r>
+    </w:p>
+    <w:p>
+      <w:pPr>
+        <w:pStyle w:val="Frontmatter"/>
+      </w:pPr>
+      <w:r>
+        <w:t xml:space="preserve">  - test</w:t>
+      </w:r>
+    </w:p>
+    <w:p>
+      <w:pPr>
+        <w:pStyle w:val="Frontmatter"/>
+      </w:pPr>
+      <w:r>
+        <w:t xml:space="preserve">  - e2e</w:t>
+      </w:r>
+    </w:p>
+    <w:p>
+      <w:pPr>
+        <w:pStyle w:val="Frontmatter"/>
+      </w:pPr>
+      <w:proofErr w:type="spellStart"/>
+      <w:r>
+        <w:t>open_access</w:t>
+      </w:r>
+      <w:proofErr w:type="spellEnd"/>
+      <w:r>
+        <w:t>: true</w:t>
+      </w:r>
+    </w:p>
+    <w:p>
+      <w:pPr>
+        <w:pStyle w:val="Frontmatter"/>
+      </w:pPr>
+      <w:r>
+        <w:t>license</w:t>
+      </w:r>
+      <w:r>
+        <w:t xml:space="preserve">: </w:t>
+      </w:r>
+      <w:r>
+        <w:t>CC-BY-NC-ND-4.0</w:t>
+      </w:r>
+    </w:p>
+    <w:p>
+      <w:pPr>
+        <w:pStyle w:val="Frontmatter"/>
+      </w:pPr>
+      <w:proofErr w:type="spellStart"/>
+      <w:r>
+        <w:t>github</w:t>
+      </w:r>
+      <w:proofErr w:type="spellEnd"/>
+      <w:r>
+        <w:t xml:space="preserve">: </w:t>
+      </w:r>
+      <w:r>
+        <w:t>https://github.com/monograph-prototypes/</w:t>
+      </w:r>
+      <w:r>
+        <w:t>split-to-multiple-chapters</w:t>
+      </w:r>
+    </w:p>
+    <w:p>
+      <w:pPr>
+        <w:pStyle w:val="Frontmatter"/>
+      </w:pPr>
+      <w:r>
+        <w:t>---</w:t>
+      </w:r>
+    </w:p>
     <w:p>
       <w:pPr>
         <w:pStyle w:val="Heading1"/>
@@ -252,6 +765,7 @@
         <w:jc w:val="both"/>
       </w:pPr>
       <w:r>
+        <w:lastRenderedPageBreak/>
         <w:t>Below is an admonition example.</w:t>
       </w:r>
     </w:p>
@@ -1704,6 +2218,119 @@
     </w:lvl>
   </w:abstractNum>
   <w:abstractNum w:abstractNumId="15" w15:restartNumberingAfterBreak="0">
+    <w:nsid w:val="28126666"/>
+    <w:multiLevelType w:val="hybridMultilevel"/>
+    <w:tmpl w:val="230CFBEC"/>
+    <w:lvl w:ilvl="0" w:tplc="04090001">
+      <w:start w:val="1"/>
+      <w:numFmt w:val="bullet"/>
+      <w:lvlText w:val=""/>
+      <w:lvlJc w:val="left"/>
+      <w:pPr>
+        <w:ind w:left="720" w:hanging="360"/>
+      </w:pPr>
+      <w:rPr>
+        <w:rFonts w:ascii="Symbol" w:hAnsi="Symbol" w:hint="default"/>
+      </w:rPr>
+    </w:lvl>
+    <w:lvl w:ilvl="1" w:tplc="04090003" w:tentative="1">
+      <w:start w:val="1"/>
+      <w:numFmt w:val="bullet"/>
+      <w:lvlText w:val="o"/>
+      <w:lvlJc w:val="left"/>
+      <w:pPr>
+        <w:ind w:left="1440" w:hanging="360"/>
+      </w:pPr>
+      <w:rPr>
+        <w:rFonts w:ascii="Courier New" w:hAnsi="Courier New" w:cs="Courier New" w:hint="default"/>
+      </w:rPr>
+    </w:lvl>
+    <w:lvl w:ilvl="2" w:tplc="04090005" w:tentative="1">
+      <w:start w:val="1"/>
+      <w:numFmt w:val="bullet"/>
+      <w:lvlText w:val=""/>
+      <w:lvlJc w:val="left"/>
+      <w:pPr>
+        <w:ind w:left="2160" w:hanging="360"/>
+      </w:pPr>
+      <w:rPr>
+        <w:rFonts w:ascii="Wingdings" w:hAnsi="Wingdings" w:hint="default"/>
+      </w:rPr>
+    </w:lvl>
+    <w:lvl w:ilvl="3" w:tplc="04090001" w:tentative="1">
+      <w:start w:val="1"/>
+      <w:numFmt w:val="bullet"/>
+      <w:lvlText w:val=""/>
+      <w:lvlJc w:val="left"/>
+      <w:pPr>
+        <w:ind w:left="2880" w:hanging="360"/>
+      </w:pPr>
+      <w:rPr>
+        <w:rFonts w:ascii="Symbol" w:hAnsi="Symbol" w:hint="default"/>
+      </w:rPr>
+    </w:lvl>
+    <w:lvl w:ilvl="4" w:tplc="04090003" w:tentative="1">
+      <w:start w:val="1"/>
+      <w:numFmt w:val="bullet"/>
+      <w:lvlText w:val="o"/>
+      <w:lvlJc w:val="left"/>
+      <w:pPr>
+        <w:ind w:left="3600" w:hanging="360"/>
+      </w:pPr>
+      <w:rPr>
+        <w:rFonts w:ascii="Courier New" w:hAnsi="Courier New" w:cs="Courier New" w:hint="default"/>
+      </w:rPr>
+    </w:lvl>
+    <w:lvl w:ilvl="5" w:tplc="04090005" w:tentative="1">
+      <w:start w:val="1"/>
+      <w:numFmt w:val="bullet"/>
+      <w:lvlText w:val=""/>
+      <w:lvlJc w:val="left"/>
+      <w:pPr>
+        <w:ind w:left="4320" w:hanging="360"/>
+      </w:pPr>
+      <w:rPr>
+        <w:rFonts w:ascii="Wingdings" w:hAnsi="Wingdings" w:hint="default"/>
+      </w:rPr>
+    </w:lvl>
+    <w:lvl w:ilvl="6" w:tplc="04090001" w:tentative="1">
+      <w:start w:val="1"/>
+      <w:numFmt w:val="bullet"/>
+      <w:lvlText w:val=""/>
+      <w:lvlJc w:val="left"/>
+      <w:pPr>
+        <w:ind w:left="5040" w:hanging="360"/>
+      </w:pPr>
+      <w:rPr>
+        <w:rFonts w:ascii="Symbol" w:hAnsi="Symbol" w:hint="default"/>
+      </w:rPr>
+    </w:lvl>
+    <w:lvl w:ilvl="7" w:tplc="04090003" w:tentative="1">
+      <w:start w:val="1"/>
+      <w:numFmt w:val="bullet"/>
+      <w:lvlText w:val="o"/>
+      <w:lvlJc w:val="left"/>
+      <w:pPr>
+        <w:ind w:left="5760" w:hanging="360"/>
+      </w:pPr>
+      <w:rPr>
+        <w:rFonts w:ascii="Courier New" w:hAnsi="Courier New" w:cs="Courier New" w:hint="default"/>
+      </w:rPr>
+    </w:lvl>
+    <w:lvl w:ilvl="8" w:tplc="04090005" w:tentative="1">
+      <w:start w:val="1"/>
+      <w:numFmt w:val="bullet"/>
+      <w:lvlText w:val=""/>
+      <w:lvlJc w:val="left"/>
+      <w:pPr>
+        <w:ind w:left="6480" w:hanging="360"/>
+      </w:pPr>
+      <w:rPr>
+        <w:rFonts w:ascii="Wingdings" w:hAnsi="Wingdings" w:hint="default"/>
+      </w:rPr>
+    </w:lvl>
+  </w:abstractNum>
+  <w:abstractNum w:abstractNumId="16" w15:restartNumberingAfterBreak="0">
     <w:nsid w:val="28CC52E1"/>
     <w:multiLevelType w:val="hybridMultilevel"/>
     <w:tmpl w:val="8B12C06A"/>
@@ -1816,7 +2443,7 @@
       </w:rPr>
     </w:lvl>
   </w:abstractNum>
-  <w:abstractNum w:abstractNumId="16" w15:restartNumberingAfterBreak="0">
+  <w:abstractNum w:abstractNumId="17" w15:restartNumberingAfterBreak="0">
     <w:nsid w:val="2C1AE401"/>
     <w:multiLevelType w:val="multilevel"/>
     <w:tmpl w:val="64360864"/>
@@ -1920,7 +2547,7 @@
       </w:pPr>
     </w:lvl>
   </w:abstractNum>
-  <w:abstractNum w:abstractNumId="17" w15:restartNumberingAfterBreak="0">
+  <w:abstractNum w:abstractNumId="18" w15:restartNumberingAfterBreak="0">
     <w:nsid w:val="315A11B2"/>
     <w:multiLevelType w:val="hybridMultilevel"/>
     <w:tmpl w:val="4052F9D0"/>
@@ -2033,7 +2660,7 @@
       </w:rPr>
     </w:lvl>
   </w:abstractNum>
-  <w:abstractNum w:abstractNumId="18" w15:restartNumberingAfterBreak="0">
+  <w:abstractNum w:abstractNumId="19" w15:restartNumberingAfterBreak="0">
     <w:nsid w:val="367023E6"/>
     <w:multiLevelType w:val="hybridMultilevel"/>
     <w:tmpl w:val="DD0811C2"/>
@@ -2146,7 +2773,7 @@
       </w:rPr>
     </w:lvl>
   </w:abstractNum>
-  <w:abstractNum w:abstractNumId="19" w15:restartNumberingAfterBreak="0">
+  <w:abstractNum w:abstractNumId="20" w15:restartNumberingAfterBreak="0">
     <w:nsid w:val="457E48F3"/>
     <w:multiLevelType w:val="hybridMultilevel"/>
     <w:tmpl w:val="C2BA1482"/>
@@ -2259,7 +2886,7 @@
       </w:rPr>
     </w:lvl>
   </w:abstractNum>
-  <w:abstractNum w:abstractNumId="20" w15:restartNumberingAfterBreak="0">
+  <w:abstractNum w:abstractNumId="21" w15:restartNumberingAfterBreak="0">
     <w:nsid w:val="468E68A9"/>
     <w:multiLevelType w:val="multilevel"/>
     <w:tmpl w:val="0409001F"/>
@@ -2345,7 +2972,7 @@
       </w:pPr>
     </w:lvl>
   </w:abstractNum>
-  <w:abstractNum w:abstractNumId="21" w15:restartNumberingAfterBreak="0">
+  <w:abstractNum w:abstractNumId="22" w15:restartNumberingAfterBreak="0">
     <w:nsid w:val="50075D6F"/>
     <w:multiLevelType w:val="hybridMultilevel"/>
     <w:tmpl w:val="851854AC"/>
@@ -2458,7 +3085,120 @@
       </w:rPr>
     </w:lvl>
   </w:abstractNum>
-  <w:abstractNum w:abstractNumId="22" w15:restartNumberingAfterBreak="0">
+  <w:abstractNum w:abstractNumId="23" w15:restartNumberingAfterBreak="0">
+    <w:nsid w:val="50FC0B20"/>
+    <w:multiLevelType w:val="hybridMultilevel"/>
+    <w:tmpl w:val="0A0E1832"/>
+    <w:lvl w:ilvl="0" w:tplc="04090001">
+      <w:start w:val="1"/>
+      <w:numFmt w:val="bullet"/>
+      <w:lvlText w:val=""/>
+      <w:lvlJc w:val="left"/>
+      <w:pPr>
+        <w:ind w:left="720" w:hanging="360"/>
+      </w:pPr>
+      <w:rPr>
+        <w:rFonts w:ascii="Symbol" w:hAnsi="Symbol" w:hint="default"/>
+      </w:rPr>
+    </w:lvl>
+    <w:lvl w:ilvl="1" w:tplc="04090003" w:tentative="1">
+      <w:start w:val="1"/>
+      <w:numFmt w:val="bullet"/>
+      <w:lvlText w:val="o"/>
+      <w:lvlJc w:val="left"/>
+      <w:pPr>
+        <w:ind w:left="1440" w:hanging="360"/>
+      </w:pPr>
+      <w:rPr>
+        <w:rFonts w:ascii="Courier New" w:hAnsi="Courier New" w:cs="Courier New" w:hint="default"/>
+      </w:rPr>
+    </w:lvl>
+    <w:lvl w:ilvl="2" w:tplc="04090005" w:tentative="1">
+      <w:start w:val="1"/>
+      <w:numFmt w:val="bullet"/>
+      <w:lvlText w:val=""/>
+      <w:lvlJc w:val="left"/>
+      <w:pPr>
+        <w:ind w:left="2160" w:hanging="360"/>
+      </w:pPr>
+      <w:rPr>
+        <w:rFonts w:ascii="Wingdings" w:hAnsi="Wingdings" w:hint="default"/>
+      </w:rPr>
+    </w:lvl>
+    <w:lvl w:ilvl="3" w:tplc="04090001" w:tentative="1">
+      <w:start w:val="1"/>
+      <w:numFmt w:val="bullet"/>
+      <w:lvlText w:val=""/>
+      <w:lvlJc w:val="left"/>
+      <w:pPr>
+        <w:ind w:left="2880" w:hanging="360"/>
+      </w:pPr>
+      <w:rPr>
+        <w:rFonts w:ascii="Symbol" w:hAnsi="Symbol" w:hint="default"/>
+      </w:rPr>
+    </w:lvl>
+    <w:lvl w:ilvl="4" w:tplc="04090003" w:tentative="1">
+      <w:start w:val="1"/>
+      <w:numFmt w:val="bullet"/>
+      <w:lvlText w:val="o"/>
+      <w:lvlJc w:val="left"/>
+      <w:pPr>
+        <w:ind w:left="3600" w:hanging="360"/>
+      </w:pPr>
+      <w:rPr>
+        <w:rFonts w:ascii="Courier New" w:hAnsi="Courier New" w:cs="Courier New" w:hint="default"/>
+      </w:rPr>
+    </w:lvl>
+    <w:lvl w:ilvl="5" w:tplc="04090005" w:tentative="1">
+      <w:start w:val="1"/>
+      <w:numFmt w:val="bullet"/>
+      <w:lvlText w:val=""/>
+      <w:lvlJc w:val="left"/>
+      <w:pPr>
+        <w:ind w:left="4320" w:hanging="360"/>
+      </w:pPr>
+      <w:rPr>
+        <w:rFonts w:ascii="Wingdings" w:hAnsi="Wingdings" w:hint="default"/>
+      </w:rPr>
+    </w:lvl>
+    <w:lvl w:ilvl="6" w:tplc="04090001" w:tentative="1">
+      <w:start w:val="1"/>
+      <w:numFmt w:val="bullet"/>
+      <w:lvlText w:val=""/>
+      <w:lvlJc w:val="left"/>
+      <w:pPr>
+        <w:ind w:left="5040" w:hanging="360"/>
+      </w:pPr>
+      <w:rPr>
+        <w:rFonts w:ascii="Symbol" w:hAnsi="Symbol" w:hint="default"/>
+      </w:rPr>
+    </w:lvl>
+    <w:lvl w:ilvl="7" w:tplc="04090003" w:tentative="1">
+      <w:start w:val="1"/>
+      <w:numFmt w:val="bullet"/>
+      <w:lvlText w:val="o"/>
+      <w:lvlJc w:val="left"/>
+      <w:pPr>
+        <w:ind w:left="5760" w:hanging="360"/>
+      </w:pPr>
+      <w:rPr>
+        <w:rFonts w:ascii="Courier New" w:hAnsi="Courier New" w:cs="Courier New" w:hint="default"/>
+      </w:rPr>
+    </w:lvl>
+    <w:lvl w:ilvl="8" w:tplc="04090005" w:tentative="1">
+      <w:start w:val="1"/>
+      <w:numFmt w:val="bullet"/>
+      <w:lvlText w:val=""/>
+      <w:lvlJc w:val="left"/>
+      <w:pPr>
+        <w:ind w:left="6480" w:hanging="360"/>
+      </w:pPr>
+      <w:rPr>
+        <w:rFonts w:ascii="Wingdings" w:hAnsi="Wingdings" w:hint="default"/>
+      </w:rPr>
+    </w:lvl>
+  </w:abstractNum>
+  <w:abstractNum w:abstractNumId="24" w15:restartNumberingAfterBreak="0">
     <w:nsid w:val="55DE722C"/>
     <w:multiLevelType w:val="hybridMultilevel"/>
     <w:tmpl w:val="6CA4556E"/>
@@ -2571,7 +3311,7 @@
       </w:rPr>
     </w:lvl>
   </w:abstractNum>
-  <w:abstractNum w:abstractNumId="23" w15:restartNumberingAfterBreak="0">
+  <w:abstractNum w:abstractNumId="25" w15:restartNumberingAfterBreak="0">
     <w:nsid w:val="575F210A"/>
     <w:multiLevelType w:val="hybridMultilevel"/>
     <w:tmpl w:val="846C9742"/>
@@ -2684,7 +3424,7 @@
       </w:rPr>
     </w:lvl>
   </w:abstractNum>
-  <w:abstractNum w:abstractNumId="24" w15:restartNumberingAfterBreak="0">
+  <w:abstractNum w:abstractNumId="26" w15:restartNumberingAfterBreak="0">
     <w:nsid w:val="57E53DFE"/>
     <w:multiLevelType w:val="hybridMultilevel"/>
     <w:tmpl w:val="F0A45532"/>
@@ -2797,7 +3537,7 @@
       </w:rPr>
     </w:lvl>
   </w:abstractNum>
-  <w:abstractNum w:abstractNumId="25" w15:restartNumberingAfterBreak="0">
+  <w:abstractNum w:abstractNumId="27" w15:restartNumberingAfterBreak="0">
     <w:nsid w:val="59A97AF0"/>
     <w:multiLevelType w:val="hybridMultilevel"/>
     <w:tmpl w:val="52E6B1EA"/>
@@ -2910,7 +3650,459 @@
       </w:rPr>
     </w:lvl>
   </w:abstractNum>
-  <w:abstractNum w:abstractNumId="26" w15:restartNumberingAfterBreak="0">
+  <w:abstractNum w:abstractNumId="28" w15:restartNumberingAfterBreak="0">
+    <w:nsid w:val="5C8D62C6"/>
+    <w:multiLevelType w:val="hybridMultilevel"/>
+    <w:tmpl w:val="1CDC8526"/>
+    <w:lvl w:ilvl="0" w:tplc="04090001">
+      <w:start w:val="1"/>
+      <w:numFmt w:val="bullet"/>
+      <w:lvlText w:val=""/>
+      <w:lvlJc w:val="left"/>
+      <w:pPr>
+        <w:ind w:left="720" w:hanging="360"/>
+      </w:pPr>
+      <w:rPr>
+        <w:rFonts w:ascii="Symbol" w:hAnsi="Symbol" w:hint="default"/>
+      </w:rPr>
+    </w:lvl>
+    <w:lvl w:ilvl="1" w:tplc="04090003" w:tentative="1">
+      <w:start w:val="1"/>
+      <w:numFmt w:val="bullet"/>
+      <w:lvlText w:val="o"/>
+      <w:lvlJc w:val="left"/>
+      <w:pPr>
+        <w:ind w:left="1440" w:hanging="360"/>
+      </w:pPr>
+      <w:rPr>
+        <w:rFonts w:ascii="Courier New" w:hAnsi="Courier New" w:cs="Courier New" w:hint="default"/>
+      </w:rPr>
+    </w:lvl>
+    <w:lvl w:ilvl="2" w:tplc="04090005" w:tentative="1">
+      <w:start w:val="1"/>
+      <w:numFmt w:val="bullet"/>
+      <w:lvlText w:val=""/>
+      <w:lvlJc w:val="left"/>
+      <w:pPr>
+        <w:ind w:left="2160" w:hanging="360"/>
+      </w:pPr>
+      <w:rPr>
+        <w:rFonts w:ascii="Wingdings" w:hAnsi="Wingdings" w:hint="default"/>
+      </w:rPr>
+    </w:lvl>
+    <w:lvl w:ilvl="3" w:tplc="04090001" w:tentative="1">
+      <w:start w:val="1"/>
+      <w:numFmt w:val="bullet"/>
+      <w:lvlText w:val=""/>
+      <w:lvlJc w:val="left"/>
+      <w:pPr>
+        <w:ind w:left="2880" w:hanging="360"/>
+      </w:pPr>
+      <w:rPr>
+        <w:rFonts w:ascii="Symbol" w:hAnsi="Symbol" w:hint="default"/>
+      </w:rPr>
+    </w:lvl>
+    <w:lvl w:ilvl="4" w:tplc="04090003" w:tentative="1">
+      <w:start w:val="1"/>
+      <w:numFmt w:val="bullet"/>
+      <w:lvlText w:val="o"/>
+      <w:lvlJc w:val="left"/>
+      <w:pPr>
+        <w:ind w:left="3600" w:hanging="360"/>
+      </w:pPr>
+      <w:rPr>
+        <w:rFonts w:ascii="Courier New" w:hAnsi="Courier New" w:cs="Courier New" w:hint="default"/>
+      </w:rPr>
+    </w:lvl>
+    <w:lvl w:ilvl="5" w:tplc="04090005" w:tentative="1">
+      <w:start w:val="1"/>
+      <w:numFmt w:val="bullet"/>
+      <w:lvlText w:val=""/>
+      <w:lvlJc w:val="left"/>
+      <w:pPr>
+        <w:ind w:left="4320" w:hanging="360"/>
+      </w:pPr>
+      <w:rPr>
+        <w:rFonts w:ascii="Wingdings" w:hAnsi="Wingdings" w:hint="default"/>
+      </w:rPr>
+    </w:lvl>
+    <w:lvl w:ilvl="6" w:tplc="04090001" w:tentative="1">
+      <w:start w:val="1"/>
+      <w:numFmt w:val="bullet"/>
+      <w:lvlText w:val=""/>
+      <w:lvlJc w:val="left"/>
+      <w:pPr>
+        <w:ind w:left="5040" w:hanging="360"/>
+      </w:pPr>
+      <w:rPr>
+        <w:rFonts w:ascii="Symbol" w:hAnsi="Symbol" w:hint="default"/>
+      </w:rPr>
+    </w:lvl>
+    <w:lvl w:ilvl="7" w:tplc="04090003" w:tentative="1">
+      <w:start w:val="1"/>
+      <w:numFmt w:val="bullet"/>
+      <w:lvlText w:val="o"/>
+      <w:lvlJc w:val="left"/>
+      <w:pPr>
+        <w:ind w:left="5760" w:hanging="360"/>
+      </w:pPr>
+      <w:rPr>
+        <w:rFonts w:ascii="Courier New" w:hAnsi="Courier New" w:cs="Courier New" w:hint="default"/>
+      </w:rPr>
+    </w:lvl>
+    <w:lvl w:ilvl="8" w:tplc="04090005" w:tentative="1">
+      <w:start w:val="1"/>
+      <w:numFmt w:val="bullet"/>
+      <w:lvlText w:val=""/>
+      <w:lvlJc w:val="left"/>
+      <w:pPr>
+        <w:ind w:left="6480" w:hanging="360"/>
+      </w:pPr>
+      <w:rPr>
+        <w:rFonts w:ascii="Wingdings" w:hAnsi="Wingdings" w:hint="default"/>
+      </w:rPr>
+    </w:lvl>
+  </w:abstractNum>
+  <w:abstractNum w:abstractNumId="29" w15:restartNumberingAfterBreak="0">
+    <w:nsid w:val="62301F0D"/>
+    <w:multiLevelType w:val="hybridMultilevel"/>
+    <w:tmpl w:val="E97AB000"/>
+    <w:lvl w:ilvl="0" w:tplc="04090001">
+      <w:start w:val="1"/>
+      <w:numFmt w:val="bullet"/>
+      <w:lvlText w:val=""/>
+      <w:lvlJc w:val="left"/>
+      <w:pPr>
+        <w:ind w:left="720" w:hanging="360"/>
+      </w:pPr>
+      <w:rPr>
+        <w:rFonts w:ascii="Symbol" w:hAnsi="Symbol" w:hint="default"/>
+      </w:rPr>
+    </w:lvl>
+    <w:lvl w:ilvl="1" w:tplc="04090003" w:tentative="1">
+      <w:start w:val="1"/>
+      <w:numFmt w:val="bullet"/>
+      <w:lvlText w:val="o"/>
+      <w:lvlJc w:val="left"/>
+      <w:pPr>
+        <w:ind w:left="1440" w:hanging="360"/>
+      </w:pPr>
+      <w:rPr>
+        <w:rFonts w:ascii="Courier New" w:hAnsi="Courier New" w:cs="Courier New" w:hint="default"/>
+      </w:rPr>
+    </w:lvl>
+    <w:lvl w:ilvl="2" w:tplc="04090005" w:tentative="1">
+      <w:start w:val="1"/>
+      <w:numFmt w:val="bullet"/>
+      <w:lvlText w:val=""/>
+      <w:lvlJc w:val="left"/>
+      <w:pPr>
+        <w:ind w:left="2160" w:hanging="360"/>
+      </w:pPr>
+      <w:rPr>
+        <w:rFonts w:ascii="Wingdings" w:hAnsi="Wingdings" w:hint="default"/>
+      </w:rPr>
+    </w:lvl>
+    <w:lvl w:ilvl="3" w:tplc="04090001" w:tentative="1">
+      <w:start w:val="1"/>
+      <w:numFmt w:val="bullet"/>
+      <w:lvlText w:val=""/>
+      <w:lvlJc w:val="left"/>
+      <w:pPr>
+        <w:ind w:left="2880" w:hanging="360"/>
+      </w:pPr>
+      <w:rPr>
+        <w:rFonts w:ascii="Symbol" w:hAnsi="Symbol" w:hint="default"/>
+      </w:rPr>
+    </w:lvl>
+    <w:lvl w:ilvl="4" w:tplc="04090003" w:tentative="1">
+      <w:start w:val="1"/>
+      <w:numFmt w:val="bullet"/>
+      <w:lvlText w:val="o"/>
+      <w:lvlJc w:val="left"/>
+      <w:pPr>
+        <w:ind w:left="3600" w:hanging="360"/>
+      </w:pPr>
+      <w:rPr>
+        <w:rFonts w:ascii="Courier New" w:hAnsi="Courier New" w:cs="Courier New" w:hint="default"/>
+      </w:rPr>
+    </w:lvl>
+    <w:lvl w:ilvl="5" w:tplc="04090005" w:tentative="1">
+      <w:start w:val="1"/>
+      <w:numFmt w:val="bullet"/>
+      <w:lvlText w:val=""/>
+      <w:lvlJc w:val="left"/>
+      <w:pPr>
+        <w:ind w:left="4320" w:hanging="360"/>
+      </w:pPr>
+      <w:rPr>
+        <w:rFonts w:ascii="Wingdings" w:hAnsi="Wingdings" w:hint="default"/>
+      </w:rPr>
+    </w:lvl>
+    <w:lvl w:ilvl="6" w:tplc="04090001" w:tentative="1">
+      <w:start w:val="1"/>
+      <w:numFmt w:val="bullet"/>
+      <w:lvlText w:val=""/>
+      <w:lvlJc w:val="left"/>
+      <w:pPr>
+        <w:ind w:left="5040" w:hanging="360"/>
+      </w:pPr>
+      <w:rPr>
+        <w:rFonts w:ascii="Symbol" w:hAnsi="Symbol" w:hint="default"/>
+      </w:rPr>
+    </w:lvl>
+    <w:lvl w:ilvl="7" w:tplc="04090003" w:tentative="1">
+      <w:start w:val="1"/>
+      <w:numFmt w:val="bullet"/>
+      <w:lvlText w:val="o"/>
+      <w:lvlJc w:val="left"/>
+      <w:pPr>
+        <w:ind w:left="5760" w:hanging="360"/>
+      </w:pPr>
+      <w:rPr>
+        <w:rFonts w:ascii="Courier New" w:hAnsi="Courier New" w:cs="Courier New" w:hint="default"/>
+      </w:rPr>
+    </w:lvl>
+    <w:lvl w:ilvl="8" w:tplc="04090005" w:tentative="1">
+      <w:start w:val="1"/>
+      <w:numFmt w:val="bullet"/>
+      <w:lvlText w:val=""/>
+      <w:lvlJc w:val="left"/>
+      <w:pPr>
+        <w:ind w:left="6480" w:hanging="360"/>
+      </w:pPr>
+      <w:rPr>
+        <w:rFonts w:ascii="Wingdings" w:hAnsi="Wingdings" w:hint="default"/>
+      </w:rPr>
+    </w:lvl>
+  </w:abstractNum>
+  <w:abstractNum w:abstractNumId="30" w15:restartNumberingAfterBreak="0">
+    <w:nsid w:val="69F120C8"/>
+    <w:multiLevelType w:val="hybridMultilevel"/>
+    <w:tmpl w:val="7D989BBE"/>
+    <w:lvl w:ilvl="0" w:tplc="04090001">
+      <w:start w:val="1"/>
+      <w:numFmt w:val="bullet"/>
+      <w:lvlText w:val=""/>
+      <w:lvlJc w:val="left"/>
+      <w:pPr>
+        <w:ind w:left="720" w:hanging="360"/>
+      </w:pPr>
+      <w:rPr>
+        <w:rFonts w:ascii="Symbol" w:hAnsi="Symbol" w:hint="default"/>
+      </w:rPr>
+    </w:lvl>
+    <w:lvl w:ilvl="1" w:tplc="04090003" w:tentative="1">
+      <w:start w:val="1"/>
+      <w:numFmt w:val="bullet"/>
+      <w:lvlText w:val="o"/>
+      <w:lvlJc w:val="left"/>
+      <w:pPr>
+        <w:ind w:left="1440" w:hanging="360"/>
+      </w:pPr>
+      <w:rPr>
+        <w:rFonts w:ascii="Courier New" w:hAnsi="Courier New" w:cs="Courier New" w:hint="default"/>
+      </w:rPr>
+    </w:lvl>
+    <w:lvl w:ilvl="2" w:tplc="04090005" w:tentative="1">
+      <w:start w:val="1"/>
+      <w:numFmt w:val="bullet"/>
+      <w:lvlText w:val=""/>
+      <w:lvlJc w:val="left"/>
+      <w:pPr>
+        <w:ind w:left="2160" w:hanging="360"/>
+      </w:pPr>
+      <w:rPr>
+        <w:rFonts w:ascii="Wingdings" w:hAnsi="Wingdings" w:hint="default"/>
+      </w:rPr>
+    </w:lvl>
+    <w:lvl w:ilvl="3" w:tplc="04090001" w:tentative="1">
+      <w:start w:val="1"/>
+      <w:numFmt w:val="bullet"/>
+      <w:lvlText w:val=""/>
+      <w:lvlJc w:val="left"/>
+      <w:pPr>
+        <w:ind w:left="2880" w:hanging="360"/>
+      </w:pPr>
+      <w:rPr>
+        <w:rFonts w:ascii="Symbol" w:hAnsi="Symbol" w:hint="default"/>
+      </w:rPr>
+    </w:lvl>
+    <w:lvl w:ilvl="4" w:tplc="04090003" w:tentative="1">
+      <w:start w:val="1"/>
+      <w:numFmt w:val="bullet"/>
+      <w:lvlText w:val="o"/>
+      <w:lvlJc w:val="left"/>
+      <w:pPr>
+        <w:ind w:left="3600" w:hanging="360"/>
+      </w:pPr>
+      <w:rPr>
+        <w:rFonts w:ascii="Courier New" w:hAnsi="Courier New" w:cs="Courier New" w:hint="default"/>
+      </w:rPr>
+    </w:lvl>
+    <w:lvl w:ilvl="5" w:tplc="04090005" w:tentative="1">
+      <w:start w:val="1"/>
+      <w:numFmt w:val="bullet"/>
+      <w:lvlText w:val=""/>
+      <w:lvlJc w:val="left"/>
+      <w:pPr>
+        <w:ind w:left="4320" w:hanging="360"/>
+      </w:pPr>
+      <w:rPr>
+        <w:rFonts w:ascii="Wingdings" w:hAnsi="Wingdings" w:hint="default"/>
+      </w:rPr>
+    </w:lvl>
+    <w:lvl w:ilvl="6" w:tplc="04090001" w:tentative="1">
+      <w:start w:val="1"/>
+      <w:numFmt w:val="bullet"/>
+      <w:lvlText w:val=""/>
+      <w:lvlJc w:val="left"/>
+      <w:pPr>
+        <w:ind w:left="5040" w:hanging="360"/>
+      </w:pPr>
+      <w:rPr>
+        <w:rFonts w:ascii="Symbol" w:hAnsi="Symbol" w:hint="default"/>
+      </w:rPr>
+    </w:lvl>
+    <w:lvl w:ilvl="7" w:tplc="04090003" w:tentative="1">
+      <w:start w:val="1"/>
+      <w:numFmt w:val="bullet"/>
+      <w:lvlText w:val="o"/>
+      <w:lvlJc w:val="left"/>
+      <w:pPr>
+        <w:ind w:left="5760" w:hanging="360"/>
+      </w:pPr>
+      <w:rPr>
+        <w:rFonts w:ascii="Courier New" w:hAnsi="Courier New" w:cs="Courier New" w:hint="default"/>
+      </w:rPr>
+    </w:lvl>
+    <w:lvl w:ilvl="8" w:tplc="04090005" w:tentative="1">
+      <w:start w:val="1"/>
+      <w:numFmt w:val="bullet"/>
+      <w:lvlText w:val=""/>
+      <w:lvlJc w:val="left"/>
+      <w:pPr>
+        <w:ind w:left="6480" w:hanging="360"/>
+      </w:pPr>
+      <w:rPr>
+        <w:rFonts w:ascii="Wingdings" w:hAnsi="Wingdings" w:hint="default"/>
+      </w:rPr>
+    </w:lvl>
+  </w:abstractNum>
+  <w:abstractNum w:abstractNumId="31" w15:restartNumberingAfterBreak="0">
+    <w:nsid w:val="6E7A0BF0"/>
+    <w:multiLevelType w:val="hybridMultilevel"/>
+    <w:tmpl w:val="6FA80BDE"/>
+    <w:lvl w:ilvl="0" w:tplc="04090001">
+      <w:start w:val="1"/>
+      <w:numFmt w:val="bullet"/>
+      <w:lvlText w:val=""/>
+      <w:lvlJc w:val="left"/>
+      <w:pPr>
+        <w:ind w:left="720" w:hanging="360"/>
+      </w:pPr>
+      <w:rPr>
+        <w:rFonts w:ascii="Symbol" w:hAnsi="Symbol" w:hint="default"/>
+      </w:rPr>
+    </w:lvl>
+    <w:lvl w:ilvl="1" w:tplc="04090003" w:tentative="1">
+      <w:start w:val="1"/>
+      <w:numFmt w:val="bullet"/>
+      <w:lvlText w:val="o"/>
+      <w:lvlJc w:val="left"/>
+      <w:pPr>
+        <w:ind w:left="1440" w:hanging="360"/>
+      </w:pPr>
+      <w:rPr>
+        <w:rFonts w:ascii="Courier New" w:hAnsi="Courier New" w:cs="Courier New" w:hint="default"/>
+      </w:rPr>
+    </w:lvl>
+    <w:lvl w:ilvl="2" w:tplc="04090005" w:tentative="1">
+      <w:start w:val="1"/>
+      <w:numFmt w:val="bullet"/>
+      <w:lvlText w:val=""/>
+      <w:lvlJc w:val="left"/>
+      <w:pPr>
+        <w:ind w:left="2160" w:hanging="360"/>
+      </w:pPr>
+      <w:rPr>
+        <w:rFonts w:ascii="Wingdings" w:hAnsi="Wingdings" w:hint="default"/>
+      </w:rPr>
+    </w:lvl>
+    <w:lvl w:ilvl="3" w:tplc="04090001" w:tentative="1">
+      <w:start w:val="1"/>
+      <w:numFmt w:val="bullet"/>
+      <w:lvlText w:val=""/>
+      <w:lvlJc w:val="left"/>
+      <w:pPr>
+        <w:ind w:left="2880" w:hanging="360"/>
+      </w:pPr>
+      <w:rPr>
+        <w:rFonts w:ascii="Symbol" w:hAnsi="Symbol" w:hint="default"/>
+      </w:rPr>
+    </w:lvl>
+    <w:lvl w:ilvl="4" w:tplc="04090003" w:tentative="1">
+      <w:start w:val="1"/>
+      <w:numFmt w:val="bullet"/>
+      <w:lvlText w:val="o"/>
+      <w:lvlJc w:val="left"/>
+      <w:pPr>
+        <w:ind w:left="3600" w:hanging="360"/>
+      </w:pPr>
+      <w:rPr>
+        <w:rFonts w:ascii="Courier New" w:hAnsi="Courier New" w:cs="Courier New" w:hint="default"/>
+      </w:rPr>
+    </w:lvl>
+    <w:lvl w:ilvl="5" w:tplc="04090005" w:tentative="1">
+      <w:start w:val="1"/>
+      <w:numFmt w:val="bullet"/>
+      <w:lvlText w:val=""/>
+      <w:lvlJc w:val="left"/>
+      <w:pPr>
+        <w:ind w:left="4320" w:hanging="360"/>
+      </w:pPr>
+      <w:rPr>
+        <w:rFonts w:ascii="Wingdings" w:hAnsi="Wingdings" w:hint="default"/>
+      </w:rPr>
+    </w:lvl>
+    <w:lvl w:ilvl="6" w:tplc="04090001" w:tentative="1">
+      <w:start w:val="1"/>
+      <w:numFmt w:val="bullet"/>
+      <w:lvlText w:val=""/>
+      <w:lvlJc w:val="left"/>
+      <w:pPr>
+        <w:ind w:left="5040" w:hanging="360"/>
+      </w:pPr>
+      <w:rPr>
+        <w:rFonts w:ascii="Symbol" w:hAnsi="Symbol" w:hint="default"/>
+      </w:rPr>
+    </w:lvl>
+    <w:lvl w:ilvl="7" w:tplc="04090003" w:tentative="1">
+      <w:start w:val="1"/>
+      <w:numFmt w:val="bullet"/>
+      <w:lvlText w:val="o"/>
+      <w:lvlJc w:val="left"/>
+      <w:pPr>
+        <w:ind w:left="5760" w:hanging="360"/>
+      </w:pPr>
+      <w:rPr>
+        <w:rFonts w:ascii="Courier New" w:hAnsi="Courier New" w:cs="Courier New" w:hint="default"/>
+      </w:rPr>
+    </w:lvl>
+    <w:lvl w:ilvl="8" w:tplc="04090005" w:tentative="1">
+      <w:start w:val="1"/>
+      <w:numFmt w:val="bullet"/>
+      <w:lvlText w:val=""/>
+      <w:lvlJc w:val="left"/>
+      <w:pPr>
+        <w:ind w:left="6480" w:hanging="360"/>
+      </w:pPr>
+      <w:rPr>
+        <w:rFonts w:ascii="Wingdings" w:hAnsi="Wingdings" w:hint="default"/>
+      </w:rPr>
+    </w:lvl>
+  </w:abstractNum>
+  <w:abstractNum w:abstractNumId="32" w15:restartNumberingAfterBreak="0">
     <w:nsid w:val="6FAC6D9D"/>
     <w:multiLevelType w:val="hybridMultilevel"/>
     <w:tmpl w:val="F7122796"/>
@@ -3023,7 +4215,7 @@
       </w:rPr>
     </w:lvl>
   </w:abstractNum>
-  <w:abstractNum w:abstractNumId="27" w15:restartNumberingAfterBreak="0">
+  <w:abstractNum w:abstractNumId="33" w15:restartNumberingAfterBreak="0">
     <w:nsid w:val="71315DCA"/>
     <w:multiLevelType w:val="multilevel"/>
     <w:tmpl w:val="19CE79B8"/>
@@ -3136,7 +4328,7 @@
       </w:pPr>
     </w:lvl>
   </w:abstractNum>
-  <w:abstractNum w:abstractNumId="28" w15:restartNumberingAfterBreak="0">
+  <w:abstractNum w:abstractNumId="34" w15:restartNumberingAfterBreak="0">
     <w:nsid w:val="74024FC2"/>
     <w:multiLevelType w:val="hybridMultilevel"/>
     <w:tmpl w:val="44ACD7FE"/>
@@ -3250,7 +4442,7 @@
       </w:rPr>
     </w:lvl>
   </w:abstractNum>
-  <w:abstractNum w:abstractNumId="29" w15:restartNumberingAfterBreak="0">
+  <w:abstractNum w:abstractNumId="35" w15:restartNumberingAfterBreak="0">
     <w:nsid w:val="7652062D"/>
     <w:multiLevelType w:val="hybridMultilevel"/>
     <w:tmpl w:val="5DA86FC8"/>
@@ -3364,7 +4556,7 @@
     </w:lvl>
   </w:abstractNum>
   <w:num w:numId="1" w16cid:durableId="1404260854">
-    <w:abstractNumId w:val="16"/>
+    <w:abstractNumId w:val="17"/>
   </w:num>
   <w:num w:numId="2" w16cid:durableId="1891770459">
     <w:abstractNumId w:val="0"/>
@@ -3382,7 +4574,7 @@
     <w:abstractNumId w:val="0"/>
   </w:num>
   <w:num w:numId="7" w16cid:durableId="234896716">
-    <w:abstractNumId w:val="27"/>
+    <w:abstractNumId w:val="33"/>
     <w:lvlOverride w:ilvl="0">
       <w:startOverride w:val="1"/>
     </w:lvlOverride>
@@ -3412,7 +4604,7 @@
     </w:lvlOverride>
   </w:num>
   <w:num w:numId="8" w16cid:durableId="404761754">
-    <w:abstractNumId w:val="27"/>
+    <w:abstractNumId w:val="33"/>
     <w:lvlOverride w:ilvl="0">
       <w:startOverride w:val="1"/>
     </w:lvlOverride>
@@ -3484,19 +4676,19 @@
     <w:abstractNumId w:val="1"/>
   </w:num>
   <w:num w:numId="23" w16cid:durableId="1483038871">
+    <w:abstractNumId w:val="21"/>
+  </w:num>
+  <w:num w:numId="24" w16cid:durableId="135612909">
     <w:abstractNumId w:val="20"/>
   </w:num>
-  <w:num w:numId="24" w16cid:durableId="135612909">
-    <w:abstractNumId w:val="19"/>
-  </w:num>
   <w:num w:numId="25" w16cid:durableId="1802571389">
-    <w:abstractNumId w:val="28"/>
+    <w:abstractNumId w:val="34"/>
   </w:num>
   <w:num w:numId="26" w16cid:durableId="1831215977">
-    <w:abstractNumId w:val="17"/>
+    <w:abstractNumId w:val="18"/>
   </w:num>
   <w:num w:numId="27" w16cid:durableId="1569221027">
-    <w:abstractNumId w:val="25"/>
+    <w:abstractNumId w:val="27"/>
   </w:num>
   <w:num w:numId="28" w16cid:durableId="1929918828">
     <w:abstractNumId w:val="14"/>
@@ -3508,31 +4700,49 @@
     <w:abstractNumId w:val="12"/>
   </w:num>
   <w:num w:numId="31" w16cid:durableId="1011302362">
+    <w:abstractNumId w:val="26"/>
+  </w:num>
+  <w:num w:numId="32" w16cid:durableId="618492491">
+    <w:abstractNumId w:val="35"/>
+  </w:num>
+  <w:num w:numId="33" w16cid:durableId="2018534185">
     <w:abstractNumId w:val="24"/>
   </w:num>
-  <w:num w:numId="32" w16cid:durableId="618492491">
-    <w:abstractNumId w:val="29"/>
+  <w:num w:numId="34" w16cid:durableId="1129012035">
+    <w:abstractNumId w:val="25"/>
   </w:num>
-  <w:num w:numId="33" w16cid:durableId="2018534185">
+  <w:num w:numId="35" w16cid:durableId="445462800">
     <w:abstractNumId w:val="22"/>
   </w:num>
-  <w:num w:numId="34" w16cid:durableId="1129012035">
-    <w:abstractNumId w:val="23"/>
-  </w:num>
-  <w:num w:numId="35" w16cid:durableId="445462800">
-    <w:abstractNumId w:val="21"/>
-  </w:num>
   <w:num w:numId="36" w16cid:durableId="659430093">
-    <w:abstractNumId w:val="26"/>
+    <w:abstractNumId w:val="32"/>
   </w:num>
   <w:num w:numId="37" w16cid:durableId="469515221">
-    <w:abstractNumId w:val="15"/>
+    <w:abstractNumId w:val="16"/>
   </w:num>
   <w:num w:numId="38" w16cid:durableId="1885946313">
     <w:abstractNumId w:val="11"/>
   </w:num>
   <w:num w:numId="39" w16cid:durableId="2002805037">
-    <w:abstractNumId w:val="18"/>
+    <w:abstractNumId w:val="19"/>
+  </w:num>
+  <w:num w:numId="40" w16cid:durableId="1057320629">
+    <w:abstractNumId w:val="28"/>
+  </w:num>
+  <w:num w:numId="41" w16cid:durableId="814906698">
+    <w:abstractNumId w:val="29"/>
+  </w:num>
+  <w:num w:numId="42" w16cid:durableId="1937396532">
+    <w:abstractNumId w:val="15"/>
+  </w:num>
+  <w:num w:numId="43" w16cid:durableId="1191187065">
+    <w:abstractNumId w:val="31"/>
+  </w:num>
+  <w:num w:numId="44" w16cid:durableId="677007384">
+    <w:abstractNumId w:val="30"/>
+  </w:num>
+  <w:num w:numId="45" w16cid:durableId="1116485824">
+    <w:abstractNumId w:val="23"/>
   </w:num>
 </w:numbering>
 </file>
@@ -3690,6 +4900,7 @@
     <w:lsdException w:name="Balloon Text" w:semiHidden="1" w:unhideWhenUsed="1"/>
     <w:lsdException w:name="Table Theme" w:semiHidden="1" w:unhideWhenUsed="1"/>
     <w:lsdException w:name="Placeholder Text" w:semiHidden="1"/>
+    <w:lsdException w:name="No Spacing" w:uiPriority="1" w:qFormat="1"/>
     <w:lsdException w:name="Light Shading"/>
     <w:lsdException w:name="Light List"/>
     <w:lsdException w:name="Light Grid"/>
@@ -5027,6 +6238,192 @@
     <w:pPr>
       <w:spacing w:after="0"/>
     </w:pPr>
+  </w:style>
+  <w:style w:type="paragraph" w:styleId="NoSpacing">
+    <w:name w:val="No Spacing"/>
+    <w:link w:val="NoSpacingChar"/>
+    <w:uiPriority w:val="1"/>
+    <w:qFormat/>
+    <w:rsid w:val="00704723"/>
+    <w:pPr>
+      <w:spacing w:after="0"/>
+    </w:pPr>
+    <w:rPr>
+      <w:sz w:val="22"/>
+      <w:szCs w:val="22"/>
+      <w:lang w:val="en-GB"/>
+    </w:rPr>
+  </w:style>
+  <w:style w:type="paragraph" w:customStyle="1" w:styleId="Frontmatter">
+    <w:name w:val="Frontmatter"/>
+    <w:basedOn w:val="Normal"/>
+    <w:link w:val="FrontmatterChar"/>
+    <w:qFormat/>
+    <w:rsid w:val="00FD725D"/>
+    <w:pPr>
+      <w:spacing w:after="0"/>
+    </w:pPr>
+    <w:rPr>
+      <w:rFonts w:ascii="Consolas" w:eastAsiaTheme="majorEastAsia" w:hAnsi="Consolas" w:cstheme="majorBidi"/>
+      <w:i/>
+      <w:iCs/>
+      <w:sz w:val="20"/>
+      <w:szCs w:val="20"/>
+    </w:rPr>
+  </w:style>
+  <w:style w:type="character" w:customStyle="1" w:styleId="NoSpacingChar">
+    <w:name w:val="No Spacing Char"/>
+    <w:basedOn w:val="DefaultParagraphFont"/>
+    <w:link w:val="NoSpacing"/>
+    <w:uiPriority w:val="1"/>
+    <w:rsid w:val="00AD1528"/>
+    <w:rPr>
+      <w:sz w:val="22"/>
+      <w:szCs w:val="22"/>
+      <w:lang w:val="en-GB"/>
+    </w:rPr>
+  </w:style>
+  <w:style w:type="character" w:customStyle="1" w:styleId="FrontmatterChar">
+    <w:name w:val="Frontmatter Char"/>
+    <w:basedOn w:val="NoSpacingChar"/>
+    <w:link w:val="Frontmatter"/>
+    <w:rsid w:val="00FD725D"/>
+    <w:rPr>
+      <w:rFonts w:ascii="Consolas" w:eastAsiaTheme="majorEastAsia" w:hAnsi="Consolas" w:cstheme="majorBidi"/>
+      <w:i/>
+      <w:iCs/>
+      <w:sz w:val="20"/>
+      <w:szCs w:val="20"/>
+      <w:lang w:val="en-GB"/>
+    </w:rPr>
+  </w:style>
+  <w:style w:type="paragraph" w:styleId="ListParagraph">
+    <w:name w:val="List Paragraph"/>
+    <w:basedOn w:val="Normal"/>
+    <w:rsid w:val="006C5C6E"/>
+    <w:pPr>
+      <w:ind w:left="720"/>
+      <w:contextualSpacing/>
+    </w:pPr>
+  </w:style>
+  <w:style w:type="table" w:styleId="PlainTable5">
+    <w:name w:val="Plain Table 5"/>
+    <w:basedOn w:val="TableNormal"/>
+    <w:rsid w:val="009B0C9C"/>
+    <w:pPr>
+      <w:spacing w:after="0"/>
+    </w:pPr>
+    <w:tblPr>
+      <w:tblStyleRowBandSize w:val="1"/>
+      <w:tblStyleColBandSize w:val="1"/>
+    </w:tblPr>
+    <w:tblStylePr w:type="firstRow">
+      <w:rPr>
+        <w:rFonts w:asciiTheme="majorHAnsi" w:eastAsiaTheme="majorEastAsia" w:hAnsiTheme="majorHAnsi" w:cstheme="majorBidi"/>
+        <w:i/>
+        <w:iCs/>
+        <w:sz w:val="26"/>
+      </w:rPr>
+      <w:tblPr/>
+      <w:tcPr>
+        <w:tcBorders>
+          <w:bottom w:val="single" w:sz="4" w:space="0" w:color="7F7F7F" w:themeColor="text1" w:themeTint="80"/>
+        </w:tcBorders>
+        <w:shd w:val="clear" w:color="auto" w:fill="FFFFFF" w:themeFill="background1"/>
+      </w:tcPr>
+    </w:tblStylePr>
+    <w:tblStylePr w:type="lastRow">
+      <w:rPr>
+        <w:rFonts w:asciiTheme="majorHAnsi" w:eastAsiaTheme="majorEastAsia" w:hAnsiTheme="majorHAnsi" w:cstheme="majorBidi"/>
+        <w:i/>
+        <w:iCs/>
+        <w:sz w:val="26"/>
+      </w:rPr>
+      <w:tblPr/>
+      <w:tcPr>
+        <w:tcBorders>
+          <w:top w:val="single" w:sz="4" w:space="0" w:color="7F7F7F" w:themeColor="text1" w:themeTint="80"/>
+        </w:tcBorders>
+        <w:shd w:val="clear" w:color="auto" w:fill="FFFFFF" w:themeFill="background1"/>
+      </w:tcPr>
+    </w:tblStylePr>
+    <w:tblStylePr w:type="firstCol">
+      <w:pPr>
+        <w:jc w:val="right"/>
+      </w:pPr>
+      <w:rPr>
+        <w:rFonts w:asciiTheme="majorHAnsi" w:eastAsiaTheme="majorEastAsia" w:hAnsiTheme="majorHAnsi" w:cstheme="majorBidi"/>
+        <w:i/>
+        <w:iCs/>
+        <w:sz w:val="26"/>
+      </w:rPr>
+      <w:tblPr/>
+      <w:tcPr>
+        <w:tcBorders>
+          <w:right w:val="single" w:sz="4" w:space="0" w:color="7F7F7F" w:themeColor="text1" w:themeTint="80"/>
+        </w:tcBorders>
+        <w:shd w:val="clear" w:color="auto" w:fill="FFFFFF" w:themeFill="background1"/>
+      </w:tcPr>
+    </w:tblStylePr>
+    <w:tblStylePr w:type="lastCol">
+      <w:rPr>
+        <w:rFonts w:asciiTheme="majorHAnsi" w:eastAsiaTheme="majorEastAsia" w:hAnsiTheme="majorHAnsi" w:cstheme="majorBidi"/>
+        <w:i/>
+        <w:iCs/>
+        <w:sz w:val="26"/>
+      </w:rPr>
+      <w:tblPr/>
+      <w:tcPr>
+        <w:tcBorders>
+          <w:left w:val="single" w:sz="4" w:space="0" w:color="7F7F7F" w:themeColor="text1" w:themeTint="80"/>
+        </w:tcBorders>
+        <w:shd w:val="clear" w:color="auto" w:fill="FFFFFF" w:themeFill="background1"/>
+      </w:tcPr>
+    </w:tblStylePr>
+    <w:tblStylePr w:type="band1Vert">
+      <w:tblPr/>
+      <w:tcPr>
+        <w:shd w:val="clear" w:color="auto" w:fill="F2F2F2" w:themeFill="background1" w:themeFillShade="F2"/>
+      </w:tcPr>
+    </w:tblStylePr>
+    <w:tblStylePr w:type="band1Horz">
+      <w:tblPr/>
+      <w:tcPr>
+        <w:shd w:val="clear" w:color="auto" w:fill="F2F2F2" w:themeFill="background1" w:themeFillShade="F2"/>
+      </w:tcPr>
+    </w:tblStylePr>
+    <w:tblStylePr w:type="neCell">
+      <w:tblPr/>
+      <w:tcPr>
+        <w:tcBorders>
+          <w:left w:val="nil"/>
+        </w:tcBorders>
+      </w:tcPr>
+    </w:tblStylePr>
+    <w:tblStylePr w:type="nwCell">
+      <w:tblPr/>
+      <w:tcPr>
+        <w:tcBorders>
+          <w:right w:val="nil"/>
+        </w:tcBorders>
+      </w:tcPr>
+    </w:tblStylePr>
+    <w:tblStylePr w:type="seCell">
+      <w:tblPr/>
+      <w:tcPr>
+        <w:tcBorders>
+          <w:left w:val="nil"/>
+        </w:tcBorders>
+      </w:tcPr>
+    </w:tblStylePr>
+    <w:tblStylePr w:type="swCell">
+      <w:tblPr/>
+      <w:tcPr>
+        <w:tcBorders>
+          <w:right w:val="nil"/>
+        </w:tcBorders>
+      </w:tcPr>
+    </w:tblStylePr>
   </w:style>
 </w:styles>
 </file>

</xml_diff>

<commit_message>
Extract table of contents from frontmatter
</commit_message>
<xml_diff>
--- a/tests/_fixtures/a_book/00_index.docx
+++ b/tests/_fixtures/a_book/00_index.docx
@@ -2,7 +2,6 @@
 <file path=word/document.xml><?xml version="1.0" encoding="utf-8"?>
 <w:document xmlns:wpc="http://schemas.microsoft.com/office/word/2010/wordprocessingCanvas" xmlns:cx="http://schemas.microsoft.com/office/drawing/2014/chartex" xmlns:cx1="http://schemas.microsoft.com/office/drawing/2015/9/8/chartex" xmlns:cx2="http://schemas.microsoft.com/office/drawing/2015/10/21/chartex" xmlns:cx3="http://schemas.microsoft.com/office/drawing/2016/5/9/chartex" xmlns:cx4="http://schemas.microsoft.com/office/drawing/2016/5/10/chartex" xmlns:cx5="http://schemas.microsoft.com/office/drawing/2016/5/11/chartex" xmlns:cx6="http://schemas.microsoft.com/office/drawing/2016/5/12/chartex" xmlns:cx7="http://schemas.microsoft.com/office/drawing/2016/5/13/chartex" xmlns:cx8="http://schemas.microsoft.com/office/drawing/2016/5/14/chartex" xmlns:mc="http://schemas.openxmlformats.org/markup-compatibility/2006" xmlns:aink="http://schemas.microsoft.com/office/drawing/2016/ink" xmlns:am3d="http://schemas.microsoft.com/office/drawing/2017/model3d" xmlns:o="urn:schemas-microsoft-com:office:office" xmlns:oel="http://schemas.microsoft.com/office/2019/extlst" xmlns:r="http://schemas.openxmlformats.org/officeDocument/2006/relationships" xmlns:m="http://schemas.openxmlformats.org/officeDocument/2006/math" xmlns:v="urn:schemas-microsoft-com:vml" xmlns:wp14="http://schemas.microsoft.com/office/word/2010/wordprocessingDrawing" xmlns:wp="http://schemas.openxmlformats.org/drawingml/2006/wordprocessingDrawing" xmlns:w10="urn:schemas-microsoft-com:office:word" xmlns:w="http://schemas.openxmlformats.org/wordprocessingml/2006/main" xmlns:w14="http://schemas.microsoft.com/office/word/2010/wordml" xmlns:w15="http://schemas.microsoft.com/office/word/2012/wordml" xmlns:w16cex="http://schemas.microsoft.com/office/word/2018/wordml/cex" xmlns:w16cid="http://schemas.microsoft.com/office/word/2016/wordml/cid" xmlns:w16="http://schemas.microsoft.com/office/word/2018/wordml" xmlns:w16du="http://schemas.microsoft.com/office/word/2023/wordml/word16du" xmlns:w16sdtdh="http://schemas.microsoft.com/office/word/2020/wordml/sdtdatahash" xmlns:w16sdtfl="http://schemas.microsoft.com/office/word/2024/wordml/sdtformatlock" xmlns:w16se="http://schemas.microsoft.com/office/word/2015/wordml/symex" xmlns:wpg="http://schemas.microsoft.com/office/word/2010/wordprocessingGroup" xmlns:wpi="http://schemas.microsoft.com/office/word/2010/wordprocessingInk" xmlns:wne="http://schemas.microsoft.com/office/word/2006/wordml" xmlns:wps="http://schemas.microsoft.com/office/word/2010/wordprocessingShape" mc:Ignorable="w14 w15 w16se w16cid w16 w16cex w16sdtdh w16sdtfl w16du wp14">
   <w:body>
-    <w:p/>
     <w:tbl>
       <w:tblPr>
         <w:tblStyle w:val="PlainTable5"/>
@@ -121,10 +120,7 @@
               <w:t xml:space="preserve">{name: </w:t>
             </w:r>
             <w:r>
-              <w:t xml:space="preserve">Elisabeth </w:t>
-            </w:r>
-            <w:r>
-              <w:t>Guerard</w:t>
+              <w:t>Elisabeth Guerard</w:t>
             </w:r>
             <w:r>
               <w:t xml:space="preserve">, affiliations: </w:t>
@@ -322,199 +318,24 @@
               <w:pStyle w:val="Frontmatter"/>
               <w:cnfStyle w:val="000000100000" w:firstRow="0" w:lastRow="0" w:firstColumn="0" w:lastColumn="0" w:oddVBand="0" w:evenVBand="0" w:oddHBand="1" w:evenHBand="0" w:firstRowFirstColumn="0" w:firstRowLastColumn="0" w:lastRowFirstColumn="0" w:lastRowLastColumn="0"/>
             </w:pPr>
-            <w:r>
-              <w:t>https://github.com/monograph-prototypes/split-to-multiple-chapters</w:t>
-            </w:r>
+            <w:hyperlink r:id="rId9" w:history="1">
+              <w:r>
+                <w:rPr>
+                  <w:rStyle w:val="Hyperlink"/>
+                </w:rPr>
+                <w:t>https://github.com/monograph-prototypes/</w:t>
+              </w:r>
+              <w:r>
+                <w:rPr>
+                  <w:rStyle w:val="Hyperlink"/>
+                </w:rPr>
+                <w:t>a-book</w:t>
+              </w:r>
+            </w:hyperlink>
           </w:p>
         </w:tc>
       </w:tr>
     </w:tbl>
-    <w:p/>
-    <w:p/>
-    <w:p>
-      <w:pPr>
-        <w:pStyle w:val="Frontmatter"/>
-      </w:pPr>
-      <w:r>
-        <w:t>---</w:t>
-      </w:r>
-    </w:p>
-    <w:p>
-      <w:pPr>
-        <w:pStyle w:val="Frontmatter"/>
-      </w:pPr>
-      <w:r>
-        <w:t>t</w:t>
-      </w:r>
-      <w:r>
-        <w:t>itle</w:t>
-      </w:r>
-      <w:r>
-        <w:t>: Just a book</w:t>
-      </w:r>
-    </w:p>
-    <w:p>
-      <w:pPr>
-        <w:pStyle w:val="Frontmatter"/>
-      </w:pPr>
-      <w:r>
-        <w:t>author</w:t>
-      </w:r>
-      <w:r>
-        <w:t>s</w:t>
-      </w:r>
-      <w:r>
-        <w:t>:</w:t>
-      </w:r>
-    </w:p>
-    <w:p>
-      <w:pPr>
-        <w:pStyle w:val="Frontmatter"/>
-      </w:pPr>
-      <w:r>
-        <w:t xml:space="preserve">  </w:t>
-      </w:r>
-      <w:r>
-        <w:t xml:space="preserve">- name: </w:t>
-      </w:r>
-      <w:r>
-        <w:t>Pawel Kaminski</w:t>
-      </w:r>
-    </w:p>
-    <w:p>
-      <w:pPr>
-        <w:pStyle w:val="Frontmatter"/>
-      </w:pPr>
-      <w:r>
-        <w:t xml:space="preserve">    affiliations: University of Luxembourg</w:t>
-      </w:r>
-    </w:p>
-    <w:p>
-      <w:pPr>
-        <w:pStyle w:val="Frontmatter"/>
-      </w:pPr>
-      <w:proofErr w:type="spellStart"/>
-      <w:r>
-        <w:t>isbn</w:t>
-      </w:r>
-      <w:proofErr w:type="spellEnd"/>
-      <w:r>
-        <w:t>:</w:t>
-      </w:r>
-    </w:p>
-    <w:p>
-      <w:pPr>
-        <w:pStyle w:val="Frontmatter"/>
-      </w:pPr>
-      <w:r>
-        <w:t xml:space="preserve">  - </w:t>
-      </w:r>
-      <w:proofErr w:type="spellStart"/>
-      <w:r>
-        <w:t>ebook</w:t>
-      </w:r>
-      <w:proofErr w:type="spellEnd"/>
-      <w:r>
-        <w:t>: 9876543210123</w:t>
-      </w:r>
-    </w:p>
-    <w:p>
-      <w:pPr>
-        <w:pStyle w:val="Frontmatter"/>
-      </w:pPr>
-      <w:r>
-        <w:t xml:space="preserve">    hardcover: 9876543210123</w:t>
-      </w:r>
-    </w:p>
-    <w:p>
-      <w:pPr>
-        <w:pStyle w:val="Frontmatter"/>
-      </w:pPr>
-      <w:r>
-        <w:t xml:space="preserve">    paperback: 9876543210123</w:t>
-      </w:r>
-    </w:p>
-    <w:p>
-      <w:pPr>
-        <w:pStyle w:val="Frontmatter"/>
-      </w:pPr>
-      <w:r>
-        <w:t>keywords</w:t>
-      </w:r>
-      <w:r>
-        <w:t>:</w:t>
-      </w:r>
-    </w:p>
-    <w:p>
-      <w:pPr>
-        <w:pStyle w:val="Frontmatter"/>
-      </w:pPr>
-      <w:r>
-        <w:t xml:space="preserve">  - test</w:t>
-      </w:r>
-    </w:p>
-    <w:p>
-      <w:pPr>
-        <w:pStyle w:val="Frontmatter"/>
-      </w:pPr>
-      <w:r>
-        <w:t xml:space="preserve">  - e2e</w:t>
-      </w:r>
-    </w:p>
-    <w:p>
-      <w:pPr>
-        <w:pStyle w:val="Frontmatter"/>
-      </w:pPr>
-      <w:proofErr w:type="spellStart"/>
-      <w:r>
-        <w:t>open_access</w:t>
-      </w:r>
-      <w:proofErr w:type="spellEnd"/>
-      <w:r>
-        <w:t>: true</w:t>
-      </w:r>
-    </w:p>
-    <w:p>
-      <w:pPr>
-        <w:pStyle w:val="Frontmatter"/>
-      </w:pPr>
-      <w:r>
-        <w:t>license</w:t>
-      </w:r>
-      <w:r>
-        <w:t xml:space="preserve">: </w:t>
-      </w:r>
-      <w:r>
-        <w:t>CC-BY-NC-ND-4.0</w:t>
-      </w:r>
-    </w:p>
-    <w:p>
-      <w:pPr>
-        <w:pStyle w:val="Frontmatter"/>
-      </w:pPr>
-      <w:proofErr w:type="spellStart"/>
-      <w:r>
-        <w:t>github</w:t>
-      </w:r>
-      <w:proofErr w:type="spellEnd"/>
-      <w:r>
-        <w:t xml:space="preserve">: </w:t>
-      </w:r>
-      <w:r>
-        <w:t>https://github.com/monograph-prototypes/</w:t>
-      </w:r>
-      <w:r>
-        <w:t>split-to-multiple-chapters</w:t>
-      </w:r>
-    </w:p>
-    <w:p>
-      <w:pPr>
-        <w:pStyle w:val="Frontmatter"/>
-      </w:pPr>
-      <w:r>
-        <w:t>---</w:t>
-      </w:r>
-    </w:p>
     <w:p>
       <w:pPr>
         <w:pStyle w:val="Heading1"/>
@@ -568,7 +389,7 @@
       <w:r>
         <w:t xml:space="preserve"> A </w:t>
       </w:r>
-      <w:hyperlink r:id="rId9" w:history="1">
+      <w:hyperlink r:id="rId10" w:history="1">
         <w:r>
           <w:rPr>
             <w:rStyle w:val="Hyperlink"/>
@@ -765,7 +586,6 @@
         <w:jc w:val="both"/>
       </w:pPr>
       <w:r>
-        <w:lastRenderedPageBreak/>
         <w:t>Below is an admonition example.</w:t>
       </w:r>
     </w:p>
@@ -982,7 +802,7 @@
                     </pic:cNvPicPr>
                   </pic:nvPicPr>
                   <pic:blipFill>
-                    <a:blip r:embed="rId10">
+                    <a:blip r:embed="rId11">
                       <a:extLst>
                         <a:ext uri="{28A0092B-C50C-407E-A947-70E740481C1C}">
                           <a14:useLocalDpi xmlns:a14="http://schemas.microsoft.com/office/drawing/2010/main" val="0"/>

</xml_diff>

<commit_message>
Update docx test examples
</commit_message>
<xml_diff>
--- a/tests/_fixtures/a_book/00_index.docx
+++ b/tests/_fixtures/a_book/00_index.docx
@@ -56,7 +56,10 @@
               <w:pStyle w:val="Frontmatter"/>
             </w:pPr>
             <w:r>
-              <w:t>title</w:t>
+              <w:t>T</w:t>
+            </w:r>
+            <w:r>
+              <w:t>itle</w:t>
             </w:r>
           </w:p>
         </w:tc>
@@ -86,7 +89,10 @@
               <w:pStyle w:val="Frontmatter"/>
             </w:pPr>
             <w:r>
-              <w:t>authors</w:t>
+              <w:t>A</w:t>
+            </w:r>
+            <w:r>
+              <w:t>uthors</w:t>
             </w:r>
           </w:p>
         </w:tc>
@@ -149,7 +155,10 @@
             </w:pPr>
             <w:proofErr w:type="spellStart"/>
             <w:r>
-              <w:t>isbn</w:t>
+              <w:t>I</w:t>
+            </w:r>
+            <w:r>
+              <w:t>sbn</w:t>
             </w:r>
             <w:proofErr w:type="spellEnd"/>
           </w:p>
@@ -188,7 +197,10 @@
               <w:pStyle w:val="Frontmatter"/>
             </w:pPr>
             <w:r>
-              <w:t>keywords</w:t>
+              <w:t>K</w:t>
+            </w:r>
+            <w:r>
+              <w:t>eywords</w:t>
             </w:r>
           </w:p>
         </w:tc>
@@ -270,7 +282,10 @@
               <w:pStyle w:val="Frontmatter"/>
             </w:pPr>
             <w:r>
-              <w:t>license</w:t>
+              <w:t>L</w:t>
+            </w:r>
+            <w:r>
+              <w:t>icense</w:t>
             </w:r>
           </w:p>
         </w:tc>
@@ -304,7 +319,10 @@
             </w:pPr>
             <w:proofErr w:type="spellStart"/>
             <w:r>
-              <w:t>github</w:t>
+              <w:t>G</w:t>
+            </w:r>
+            <w:r>
+              <w:t>ithub</w:t>
             </w:r>
             <w:proofErr w:type="spellEnd"/>
           </w:p>
@@ -323,13 +341,7 @@
                 <w:rPr>
                   <w:rStyle w:val="Hyperlink"/>
                 </w:rPr>
-                <w:t>https://github.com/monograph-prototypes/</w:t>
-              </w:r>
-              <w:r>
-                <w:rPr>
-                  <w:rStyle w:val="Hyperlink"/>
-                </w:rPr>
-                <w:t>a-book</w:t>
+                <w:t>https://github.com/monograph-prototypes/a-book</w:t>
               </w:r>
             </w:hyperlink>
           </w:p>
@@ -387,7 +399,40 @@
         <w:t>.</w:t>
       </w:r>
       <w:r>
-        <w:t xml:space="preserve"> A </w:t>
+        <w:t xml:space="preserve"> </w:t>
+      </w:r>
+      <w:r>
+        <w:t>H</w:t>
+      </w:r>
+      <w:r>
+        <w:rPr>
+          <w:vertAlign w:val="subscript"/>
+        </w:rPr>
+        <w:t>2</w:t>
+      </w:r>
+      <w:r>
+        <w:t>O</w:t>
+      </w:r>
+      <w:r>
+        <w:t xml:space="preserve"> and</w:t>
+      </w:r>
+      <w:r>
+        <w:t xml:space="preserve"> 11</w:t>
+      </w:r>
+      <w:r>
+        <w:rPr>
+          <w:vertAlign w:val="superscript"/>
+        </w:rPr>
+        <w:t>th</w:t>
+      </w:r>
+      <w:r>
+        <w:t xml:space="preserve"> of November.</w:t>
+      </w:r>
+      <w:r>
+        <w:t xml:space="preserve"> </w:t>
+      </w:r>
+      <w:r>
+        <w:t xml:space="preserve">A </w:t>
       </w:r>
       <w:hyperlink r:id="rId10" w:history="1">
         <w:r>
@@ -665,6 +710,7 @@
         <w:pStyle w:val="Heading4"/>
       </w:pPr>
       <w:r>
+        <w:lastRenderedPageBreak/>
         <w:t>Heading 4</w:t>
       </w:r>
     </w:p>
@@ -680,10 +726,99 @@
         <w:t>ontent.</w:t>
       </w:r>
       <w:r>
-        <w:t xml:space="preserve"> An example of an image is placed below</w:t>
+        <w:t xml:space="preserve"> An example of </w:t>
+      </w:r>
+      <w:bookmarkStart w:id="0" w:name="_Hlk215062712"/>
+      <w:r>
+        <w:t>citation made with Zotero</w:t>
       </w:r>
       <w:r>
         <w:t xml:space="preserve"> </w:t>
+      </w:r>
+      <w:r>
+        <w:fldChar w:fldCharType="begin"/>
+      </w:r>
+      <w:r>
+        <w:instrText xml:space="preserve"> ADDIN ZOTERO_ITEM CSL_CITATION {"citationID":"MQAb9y5G","properties":{"formattedCitation":"(Jay 2004)","plainCitation":"(Jay 2004)","noteIndex":0},"citationItems":[{"id":3,"uris":["http://zotero.org/users/local/bv74ArEQ/items/KKITI438"],"itemData":{"id":3,"type":"book","abstract":"The title says it all. Break out the crayons, 'cause it gangsta rap coloring time! 48 pages of line drawings of \"Gangsta\" rappers, done with the thick black line we all remember from the coloring books of our youth. The juxtaposition of the outlaw image of the rappers with the childlike innocence of a coloring book makes for an instant laugh.","ISBN":"9780867196047","number-of-pages":"50","publisher":"Last Gasp","title":"Gangsta Rap Coloring Book","author":[{"family":"Jay","given":"Aye"}],"issued":{"date-parts":[["2004",4,1]]}}}],"schema":"https://github.com/citation-style-language/schema/raw/master/csl-citation.json"} </w:instrText>
+      </w:r>
+      <w:r>
+        <w:fldChar w:fldCharType="separate"/>
+      </w:r>
+      <w:r>
+        <w:rPr>
+          <w:rFonts w:ascii="Cambria" w:hAnsi="Cambria"/>
+        </w:rPr>
+        <w:t>(Jay 2004)</w:t>
+      </w:r>
+      <w:r>
+        <w:fldChar w:fldCharType="end"/>
+      </w:r>
+      <w:r>
+        <w:t xml:space="preserve"> </w:t>
+      </w:r>
+      <w:bookmarkEnd w:id="0"/>
+      <w:r>
+        <w:t xml:space="preserve">and </w:t>
+      </w:r>
+      <w:r>
+        <w:t xml:space="preserve">MS Word </w:t>
+      </w:r>
+      <w:r>
+        <w:t xml:space="preserve">build-in </w:t>
+      </w:r>
+      <w:r>
+        <w:t xml:space="preserve">citation </w:t>
+      </w:r>
+      <w:r>
+        <w:t xml:space="preserve">manager </w:t>
+      </w:r>
+      <w:sdt>
+        <w:sdtPr>
+          <w:id w:val="534623020"/>
+          <w:citation/>
+        </w:sdtPr>
+        <w:sdtEndPr/>
+        <w:sdtContent>
+          <w:r>
+            <w:fldChar w:fldCharType="begin"/>
+          </w:r>
+          <w:r>
+            <w:instrText xml:space="preserve"> CITATION Per04 \l 1033 </w:instrText>
+          </w:r>
+          <w:r>
+            <w:fldChar w:fldCharType="separate"/>
+          </w:r>
+          <w:r>
+            <w:rPr>
+              <w:noProof/>
+            </w:rPr>
+            <w:t>(Perneger and Hudelson 2004)</w:t>
+          </w:r>
+          <w:r>
+            <w:fldChar w:fldCharType="end"/>
+          </w:r>
+        </w:sdtContent>
+      </w:sdt>
+      <w:r>
+        <w:t>.</w:t>
+      </w:r>
+      <w:r>
+        <w:t xml:space="preserve"> </w:t>
+      </w:r>
+      <w:r>
+        <w:t xml:space="preserve">Repeated </w:t>
+      </w:r>
+      <w:r>
+        <w:t xml:space="preserve">Zotero </w:t>
+      </w:r>
+      <w:r>
+        <w:t>citation</w:t>
+      </w:r>
+      <w:r>
+        <w:t xml:space="preserve"> </w:t>
+      </w:r>
+      <w:r>
+        <w:t xml:space="preserve">to see if it has the same id </w:t>
       </w:r>
       <w:r>
         <w:fldChar w:fldCharType="begin"/>
@@ -862,7 +997,6 @@
         <w:tc>
           <w:tcPr>
             <w:tcW w:w="1345" w:type="dxa"/>
-            <w:shd w:val="clear" w:color="auto" w:fill="auto"/>
             <w:vAlign w:val="center"/>
             <w:hideMark/>
           </w:tcPr>
@@ -917,7 +1051,6 @@
         <w:tc>
           <w:tcPr>
             <w:tcW w:w="8000" w:type="dxa"/>
-            <w:shd w:val="clear" w:color="auto" w:fill="auto"/>
             <w:vAlign w:val="center"/>
           </w:tcPr>
           <w:p>
@@ -968,7 +1101,6 @@
         <w:tc>
           <w:tcPr>
             <w:tcW w:w="1345" w:type="dxa"/>
-            <w:shd w:val="clear" w:color="auto" w:fill="auto"/>
             <w:vAlign w:val="center"/>
           </w:tcPr>
           <w:p>
@@ -1028,7 +1160,6 @@
         <w:tc>
           <w:tcPr>
             <w:tcW w:w="8000" w:type="dxa"/>
-            <w:shd w:val="clear" w:color="auto" w:fill="auto"/>
             <w:vAlign w:val="center"/>
           </w:tcPr>
           <w:p>
@@ -1079,7 +1210,6 @@
         <w:tc>
           <w:tcPr>
             <w:tcW w:w="1345" w:type="dxa"/>
-            <w:shd w:val="clear" w:color="auto" w:fill="auto"/>
             <w:vAlign w:val="center"/>
           </w:tcPr>
           <w:p>
@@ -1118,7 +1248,6 @@
         <w:tc>
           <w:tcPr>
             <w:tcW w:w="8000" w:type="dxa"/>
-            <w:shd w:val="clear" w:color="auto" w:fill="auto"/>
             <w:vAlign w:val="center"/>
           </w:tcPr>
           <w:p>
@@ -1149,7 +1278,6 @@
         <w:tc>
           <w:tcPr>
             <w:tcW w:w="1345" w:type="dxa"/>
-            <w:shd w:val="clear" w:color="auto" w:fill="auto"/>
             <w:vAlign w:val="center"/>
           </w:tcPr>
           <w:p>
@@ -1197,7 +1325,6 @@
         <w:tc>
           <w:tcPr>
             <w:tcW w:w="8000" w:type="dxa"/>
-            <w:shd w:val="clear" w:color="auto" w:fill="auto"/>
             <w:vAlign w:val="center"/>
           </w:tcPr>
           <w:p>
@@ -6603,7 +6730,7 @@
         </b:NameList>
       </b:Author>
     </b:Author>
-    <b:RefOrder>2</b:RefOrder>
+    <b:RefOrder>1</b:RefOrder>
   </b:Source>
   <b:Source>
     <b:Tag>Hol07</b:Tag>
@@ -6622,7 +6749,7 @@
         </b:NameList>
       </b:Author>
     </b:Author>
-    <b:RefOrder>1</b:RefOrder>
+    <b:RefOrder>2</b:RefOrder>
   </b:Source>
 </b:Sources>
 </file>
@@ -6636,7 +6763,7 @@
 </file>
 
 <file path=customXml/itemProps2.xml><?xml version="1.0" encoding="utf-8"?>
-<ds:datastoreItem xmlns:ds="http://schemas.openxmlformats.org/officeDocument/2006/customXml" ds:itemID="{D9997012-F355-44F0-988C-08F923840F8D}">
+<ds:datastoreItem xmlns:ds="http://schemas.openxmlformats.org/officeDocument/2006/customXml" ds:itemID="{9F06A608-DE8B-42A2-BC8B-AF6F18526949}">
   <ds:schemaRefs>
     <ds:schemaRef ds:uri="http://schemas.openxmlformats.org/officeDocument/2006/bibliography"/>
   </ds:schemaRefs>

</xml_diff>